<commit_message>
git Notes is updated
</commit_message>
<xml_diff>
--- a/GIT.docx
+++ b/GIT.docx
@@ -2,6 +2,7 @@
 <file path=word/document.xml><?xml version="1.0" encoding="utf-8"?>
 <w:document xmlns:wpc="http://schemas.microsoft.com/office/word/2010/wordprocessingCanvas" xmlns:cx="http://schemas.microsoft.com/office/drawing/2014/chartex" xmlns:cx1="http://schemas.microsoft.com/office/drawing/2015/9/8/chartex" xmlns:cx2="http://schemas.microsoft.com/office/drawing/2015/10/21/chartex" xmlns:cx3="http://schemas.microsoft.com/office/drawing/2016/5/9/chartex" xmlns:cx4="http://schemas.microsoft.com/office/drawing/2016/5/10/chartex" xmlns:cx5="http://schemas.microsoft.com/office/drawing/2016/5/11/chartex" xmlns:cx6="http://schemas.microsoft.com/office/drawing/2016/5/12/chartex" xmlns:cx7="http://schemas.microsoft.com/office/drawing/2016/5/13/chartex" xmlns:cx8="http://schemas.microsoft.com/office/drawing/2016/5/14/chartex" xmlns:mc="http://schemas.openxmlformats.org/markup-compatibility/2006" xmlns:aink="http://schemas.microsoft.com/office/drawing/2016/ink" xmlns:am3d="http://schemas.microsoft.com/office/drawing/2017/model3d" xmlns:o="urn:schemas-microsoft-com:office:office" xmlns:oel="http://schemas.microsoft.com/office/2019/extlst" xmlns:r="http://schemas.openxmlformats.org/officeDocument/2006/relationships" xmlns:m="http://schemas.openxmlformats.org/officeDocument/2006/math" xmlns:v="urn:schemas-microsoft-com:vml" xmlns:wp14="http://schemas.microsoft.com/office/word/2010/wordprocessingDrawing" xmlns:wp="http://schemas.openxmlformats.org/drawingml/2006/wordprocessingDrawing" xmlns:w10="urn:schemas-microsoft-com:office:word" xmlns:w="http://schemas.openxmlformats.org/wordprocessingml/2006/main" xmlns:w14="http://schemas.microsoft.com/office/word/2010/wordml" xmlns:w15="http://schemas.microsoft.com/office/word/2012/wordml" xmlns:w16cex="http://schemas.microsoft.com/office/word/2018/wordml/cex" xmlns:w16cid="http://schemas.microsoft.com/office/word/2016/wordml/cid" xmlns:w16="http://schemas.microsoft.com/office/word/2018/wordml" xmlns:w16du="http://schemas.microsoft.com/office/word/2023/wordml/word16du" xmlns:w16sdtdh="http://schemas.microsoft.com/office/word/2020/wordml/sdtdatahash" xmlns:w16sdtfl="http://schemas.microsoft.com/office/word/2024/wordml/sdtformatlock" xmlns:w16se="http://schemas.microsoft.com/office/word/2015/wordml/symex" xmlns:wpg="http://schemas.microsoft.com/office/word/2010/wordprocessingGroup" xmlns:wpi="http://schemas.microsoft.com/office/word/2010/wordprocessingInk" xmlns:wne="http://schemas.microsoft.com/office/word/2006/wordml" xmlns:wps="http://schemas.microsoft.com/office/word/2010/wordprocessingShape" mc:Ignorable="w14 w15 w16se w16cid w16 w16cex w16sdtdh w16sdtfl w16du wp14">
   <w:body>
+    <w:p/>
     <w:p>
       <w:pPr>
         <w:rPr>
@@ -165,6 +166,9 @@
     <w:p/>
     <w:p>
       <w:r>
+        <w:rPr>
+          <w:noProof/>
+        </w:rPr>
         <w:drawing>
           <wp:inline distT="0" distB="0" distL="0" distR="0" wp14:anchorId="4A1087AE" wp14:editId="7731F460">
             <wp:extent cx="5191850" cy="3267531"/>
@@ -212,7 +216,6 @@
         </w:numPr>
       </w:pPr>
       <w:r>
-        <w:lastRenderedPageBreak/>
         <w:t>Git Hub repository will monitor all code changes</w:t>
       </w:r>
     </w:p>
@@ -375,8 +378,8 @@
       <w:pPr>
         <w:pStyle w:val="ListParagraph"/>
         <w:numPr>
-          <w:ilvl w:val="0"/>
-          <w:numId w:val="1"/>
+          <w:ilvl w:val="1"/>
+          <w:numId w:val="15"/>
         </w:numPr>
       </w:pPr>
       <w:r>
@@ -395,8 +398,8 @@
       <w:pPr>
         <w:pStyle w:val="ListParagraph"/>
         <w:numPr>
-          <w:ilvl w:val="0"/>
-          <w:numId w:val="1"/>
+          <w:ilvl w:val="1"/>
+          <w:numId w:val="15"/>
         </w:numPr>
       </w:pPr>
       <w:r>
@@ -408,9 +411,18 @@
         <w:t>user.email</w:t>
       </w:r>
       <w:proofErr w:type="spellEnd"/>
+      <w:r>
+        <w:t xml:space="preserve"> </w:t>
+      </w:r>
+      <w:r>
+        <w:t xml:space="preserve">  </w:t>
+      </w:r>
+      <w:r>
+        <w:t>“</w:t>
+      </w:r>
       <w:proofErr w:type="gramEnd"/>
       <w:r>
-        <w:t xml:space="preserve"> “your-email”</w:t>
+        <w:t>your-email”</w:t>
       </w:r>
     </w:p>
     <w:p>
@@ -766,7 +778,6 @@
         </w:rPr>
       </w:pPr>
       <w:r>
-        <w:lastRenderedPageBreak/>
         <w:t xml:space="preserve">                                                                           </w:t>
       </w:r>
       <w:r>
@@ -1211,6 +1222,181 @@
       <w:r>
         <w:t>execution we need to execute commit and push to delete file from central repo.</w:t>
       </w:r>
+      <w:r>
+        <w:t xml:space="preserve"> </w:t>
+      </w:r>
+    </w:p>
+    <w:p>
+      <w:pPr>
+        <w:pStyle w:val="ListParagraph"/>
+        <w:numPr>
+          <w:ilvl w:val="0"/>
+          <w:numId w:val="14"/>
+        </w:numPr>
+      </w:pPr>
+      <w:r>
+        <w:rPr>
+          <w:b/>
+          <w:bCs/>
+        </w:rPr>
+        <w:t>git clone:</w:t>
+      </w:r>
+      <w:r>
+        <w:t xml:space="preserve"> to download central repo to local</w:t>
+      </w:r>
+    </w:p>
+    <w:p>
+      <w:pPr>
+        <w:pStyle w:val="ListParagraph"/>
+        <w:ind w:left="1464"/>
+      </w:pPr>
+      <w:r>
+        <w:t xml:space="preserve">                  git clone &lt;repo-</w:t>
+      </w:r>
+      <w:proofErr w:type="spellStart"/>
+      <w:r>
+        <w:t>url</w:t>
+      </w:r>
+      <w:proofErr w:type="spellEnd"/>
+      <w:r>
+        <w:t>&gt;</w:t>
+      </w:r>
+    </w:p>
+    <w:p>
+      <w:pPr>
+        <w:pStyle w:val="ListParagraph"/>
+        <w:ind w:left="1464"/>
+      </w:pPr>
+      <w:r>
+        <w:lastRenderedPageBreak/>
+        <w:t xml:space="preserve">Eg: </w:t>
+      </w:r>
+      <w:hyperlink r:id="rId13" w:history="1">
+        <w:r>
+          <w:rPr>
+            <w:rStyle w:val="Hyperlink"/>
+          </w:rPr>
+          <w:t>https://github.com/meenatripurana214-lgtm/sbi_loans_app.git</w:t>
+        </w:r>
+      </w:hyperlink>
+    </w:p>
+    <w:p/>
+    <w:p>
+      <w:pPr>
+        <w:pStyle w:val="ListParagraph"/>
+        <w:numPr>
+          <w:ilvl w:val="0"/>
+          <w:numId w:val="14"/>
+        </w:numPr>
+      </w:pPr>
+      <w:r>
+        <w:rPr>
+          <w:b/>
+          <w:bCs/>
+        </w:rPr>
+        <w:t>git pull:</w:t>
+      </w:r>
+      <w:r>
+        <w:t xml:space="preserve"> download only latest changes from central repo to local repo</w:t>
+      </w:r>
+    </w:p>
+    <w:p>
+      <w:pPr>
+        <w:pStyle w:val="ListParagraph"/>
+        <w:ind w:left="1464"/>
+      </w:pPr>
+      <w:r>
+        <w:rPr>
+          <w:b/>
+          <w:bCs/>
+        </w:rPr>
+        <w:t xml:space="preserve">                  </w:t>
+      </w:r>
+    </w:p>
+    <w:p>
+      <w:r>
+        <w:t xml:space="preserve">What </w:t>
+      </w:r>
+      <w:proofErr w:type="gramStart"/>
+      <w:r>
+        <w:t>is .</w:t>
+      </w:r>
+      <w:proofErr w:type="spellStart"/>
+      <w:r>
+        <w:t>gitignore</w:t>
+      </w:r>
+      <w:proofErr w:type="spellEnd"/>
+      <w:proofErr w:type="gramEnd"/>
+      <w:r>
+        <w:t xml:space="preserve"> file?</w:t>
+      </w:r>
+    </w:p>
+    <w:p>
+      <w:pPr>
+        <w:pStyle w:val="ListParagraph"/>
+        <w:numPr>
+          <w:ilvl w:val="0"/>
+          <w:numId w:val="1"/>
+        </w:numPr>
+      </w:pPr>
+      <w:r>
+        <w:t>It is used to specify files and folder to skip from git operations.</w:t>
+      </w:r>
+    </w:p>
+    <w:p>
+      <w:pPr>
+        <w:pStyle w:val="ListParagraph"/>
+      </w:pPr>
+      <w:r>
+        <w:t xml:space="preserve">         Eg: .settings</w:t>
+      </w:r>
+    </w:p>
+    <w:p>
+      <w:pPr>
+        <w:pStyle w:val="ListParagraph"/>
+      </w:pPr>
+      <w:r>
+        <w:t xml:space="preserve">                </w:t>
+      </w:r>
+      <w:proofErr w:type="gramStart"/>
+      <w:r>
+        <w:t>.</w:t>
+      </w:r>
+      <w:proofErr w:type="spellStart"/>
+      <w:r>
+        <w:t>classpath</w:t>
+      </w:r>
+      <w:proofErr w:type="spellEnd"/>
+      <w:proofErr w:type="gramEnd"/>
+    </w:p>
+    <w:p>
+      <w:pPr>
+        <w:pStyle w:val="ListParagraph"/>
+      </w:pPr>
+      <w:r>
+        <w:t xml:space="preserve">                </w:t>
+      </w:r>
+      <w:proofErr w:type="gramStart"/>
+      <w:r>
+        <w:t>.project</w:t>
+      </w:r>
+      <w:proofErr w:type="gramEnd"/>
+    </w:p>
+    <w:p>
+      <w:pPr>
+        <w:pStyle w:val="ListParagraph"/>
+      </w:pPr>
+      <w:r>
+        <w:t xml:space="preserve">                 target/</w:t>
+      </w:r>
+    </w:p>
+    <w:p>
+      <w:pPr>
+        <w:pStyle w:val="ListParagraph"/>
+      </w:pPr>
+      <w:r>
+        <w:t xml:space="preserve">               </w:t>
+      </w:r>
     </w:p>
     <w:p/>
     <w:p>
@@ -1844,6 +2030,119 @@
     </w:lvl>
   </w:abstractNum>
   <w:abstractNum w:abstractNumId="6" w15:restartNumberingAfterBreak="0">
+    <w:nsid w:val="274F2E9E"/>
+    <w:multiLevelType w:val="hybridMultilevel"/>
+    <w:tmpl w:val="3272ABA6"/>
+    <w:lvl w:ilvl="0" w:tplc="4009000B">
+      <w:start w:val="1"/>
+      <w:numFmt w:val="bullet"/>
+      <w:lvlText w:val=""/>
+      <w:lvlJc w:val="left"/>
+      <w:pPr>
+        <w:ind w:left="1212" w:hanging="360"/>
+      </w:pPr>
+      <w:rPr>
+        <w:rFonts w:ascii="Wingdings" w:hAnsi="Wingdings" w:hint="default"/>
+      </w:rPr>
+    </w:lvl>
+    <w:lvl w:ilvl="1" w:tplc="40090003" w:tentative="1">
+      <w:start w:val="1"/>
+      <w:numFmt w:val="bullet"/>
+      <w:lvlText w:val="o"/>
+      <w:lvlJc w:val="left"/>
+      <w:pPr>
+        <w:ind w:left="1932" w:hanging="360"/>
+      </w:pPr>
+      <w:rPr>
+        <w:rFonts w:ascii="Courier New" w:hAnsi="Courier New" w:cs="Courier New" w:hint="default"/>
+      </w:rPr>
+    </w:lvl>
+    <w:lvl w:ilvl="2" w:tplc="40090005" w:tentative="1">
+      <w:start w:val="1"/>
+      <w:numFmt w:val="bullet"/>
+      <w:lvlText w:val=""/>
+      <w:lvlJc w:val="left"/>
+      <w:pPr>
+        <w:ind w:left="2652" w:hanging="360"/>
+      </w:pPr>
+      <w:rPr>
+        <w:rFonts w:ascii="Wingdings" w:hAnsi="Wingdings" w:hint="default"/>
+      </w:rPr>
+    </w:lvl>
+    <w:lvl w:ilvl="3" w:tplc="40090001" w:tentative="1">
+      <w:start w:val="1"/>
+      <w:numFmt w:val="bullet"/>
+      <w:lvlText w:val=""/>
+      <w:lvlJc w:val="left"/>
+      <w:pPr>
+        <w:ind w:left="3372" w:hanging="360"/>
+      </w:pPr>
+      <w:rPr>
+        <w:rFonts w:ascii="Symbol" w:hAnsi="Symbol" w:hint="default"/>
+      </w:rPr>
+    </w:lvl>
+    <w:lvl w:ilvl="4" w:tplc="40090003" w:tentative="1">
+      <w:start w:val="1"/>
+      <w:numFmt w:val="bullet"/>
+      <w:lvlText w:val="o"/>
+      <w:lvlJc w:val="left"/>
+      <w:pPr>
+        <w:ind w:left="4092" w:hanging="360"/>
+      </w:pPr>
+      <w:rPr>
+        <w:rFonts w:ascii="Courier New" w:hAnsi="Courier New" w:cs="Courier New" w:hint="default"/>
+      </w:rPr>
+    </w:lvl>
+    <w:lvl w:ilvl="5" w:tplc="40090005" w:tentative="1">
+      <w:start w:val="1"/>
+      <w:numFmt w:val="bullet"/>
+      <w:lvlText w:val=""/>
+      <w:lvlJc w:val="left"/>
+      <w:pPr>
+        <w:ind w:left="4812" w:hanging="360"/>
+      </w:pPr>
+      <w:rPr>
+        <w:rFonts w:ascii="Wingdings" w:hAnsi="Wingdings" w:hint="default"/>
+      </w:rPr>
+    </w:lvl>
+    <w:lvl w:ilvl="6" w:tplc="40090001" w:tentative="1">
+      <w:start w:val="1"/>
+      <w:numFmt w:val="bullet"/>
+      <w:lvlText w:val=""/>
+      <w:lvlJc w:val="left"/>
+      <w:pPr>
+        <w:ind w:left="5532" w:hanging="360"/>
+      </w:pPr>
+      <w:rPr>
+        <w:rFonts w:ascii="Symbol" w:hAnsi="Symbol" w:hint="default"/>
+      </w:rPr>
+    </w:lvl>
+    <w:lvl w:ilvl="7" w:tplc="40090003" w:tentative="1">
+      <w:start w:val="1"/>
+      <w:numFmt w:val="bullet"/>
+      <w:lvlText w:val="o"/>
+      <w:lvlJc w:val="left"/>
+      <w:pPr>
+        <w:ind w:left="6252" w:hanging="360"/>
+      </w:pPr>
+      <w:rPr>
+        <w:rFonts w:ascii="Courier New" w:hAnsi="Courier New" w:cs="Courier New" w:hint="default"/>
+      </w:rPr>
+    </w:lvl>
+    <w:lvl w:ilvl="8" w:tplc="40090005" w:tentative="1">
+      <w:start w:val="1"/>
+      <w:numFmt w:val="bullet"/>
+      <w:lvlText w:val=""/>
+      <w:lvlJc w:val="left"/>
+      <w:pPr>
+        <w:ind w:left="6972" w:hanging="360"/>
+      </w:pPr>
+      <w:rPr>
+        <w:rFonts w:ascii="Wingdings" w:hAnsi="Wingdings" w:hint="default"/>
+      </w:rPr>
+    </w:lvl>
+  </w:abstractNum>
+  <w:abstractNum w:abstractNumId="7" w15:restartNumberingAfterBreak="0">
     <w:nsid w:val="2E3C72E0"/>
     <w:multiLevelType w:val="hybridMultilevel"/>
     <w:tmpl w:val="4A3430D8"/>
@@ -1956,7 +2255,346 @@
       </w:rPr>
     </w:lvl>
   </w:abstractNum>
-  <w:abstractNum w:abstractNumId="7" w15:restartNumberingAfterBreak="0">
+  <w:abstractNum w:abstractNumId="8" w15:restartNumberingAfterBreak="0">
+    <w:nsid w:val="35D326EC"/>
+    <w:multiLevelType w:val="hybridMultilevel"/>
+    <w:tmpl w:val="C3121746"/>
+    <w:lvl w:ilvl="0" w:tplc="4009000B">
+      <w:start w:val="1"/>
+      <w:numFmt w:val="bullet"/>
+      <w:lvlText w:val=""/>
+      <w:lvlJc w:val="left"/>
+      <w:pPr>
+        <w:ind w:left="1812" w:hanging="360"/>
+      </w:pPr>
+      <w:rPr>
+        <w:rFonts w:ascii="Wingdings" w:hAnsi="Wingdings" w:hint="default"/>
+      </w:rPr>
+    </w:lvl>
+    <w:lvl w:ilvl="1" w:tplc="40090003" w:tentative="1">
+      <w:start w:val="1"/>
+      <w:numFmt w:val="bullet"/>
+      <w:lvlText w:val="o"/>
+      <w:lvlJc w:val="left"/>
+      <w:pPr>
+        <w:ind w:left="2532" w:hanging="360"/>
+      </w:pPr>
+      <w:rPr>
+        <w:rFonts w:ascii="Courier New" w:hAnsi="Courier New" w:cs="Courier New" w:hint="default"/>
+      </w:rPr>
+    </w:lvl>
+    <w:lvl w:ilvl="2" w:tplc="40090005" w:tentative="1">
+      <w:start w:val="1"/>
+      <w:numFmt w:val="bullet"/>
+      <w:lvlText w:val=""/>
+      <w:lvlJc w:val="left"/>
+      <w:pPr>
+        <w:ind w:left="3252" w:hanging="360"/>
+      </w:pPr>
+      <w:rPr>
+        <w:rFonts w:ascii="Wingdings" w:hAnsi="Wingdings" w:hint="default"/>
+      </w:rPr>
+    </w:lvl>
+    <w:lvl w:ilvl="3" w:tplc="40090001" w:tentative="1">
+      <w:start w:val="1"/>
+      <w:numFmt w:val="bullet"/>
+      <w:lvlText w:val=""/>
+      <w:lvlJc w:val="left"/>
+      <w:pPr>
+        <w:ind w:left="3972" w:hanging="360"/>
+      </w:pPr>
+      <w:rPr>
+        <w:rFonts w:ascii="Symbol" w:hAnsi="Symbol" w:hint="default"/>
+      </w:rPr>
+    </w:lvl>
+    <w:lvl w:ilvl="4" w:tplc="40090003" w:tentative="1">
+      <w:start w:val="1"/>
+      <w:numFmt w:val="bullet"/>
+      <w:lvlText w:val="o"/>
+      <w:lvlJc w:val="left"/>
+      <w:pPr>
+        <w:ind w:left="4692" w:hanging="360"/>
+      </w:pPr>
+      <w:rPr>
+        <w:rFonts w:ascii="Courier New" w:hAnsi="Courier New" w:cs="Courier New" w:hint="default"/>
+      </w:rPr>
+    </w:lvl>
+    <w:lvl w:ilvl="5" w:tplc="40090005" w:tentative="1">
+      <w:start w:val="1"/>
+      <w:numFmt w:val="bullet"/>
+      <w:lvlText w:val=""/>
+      <w:lvlJc w:val="left"/>
+      <w:pPr>
+        <w:ind w:left="5412" w:hanging="360"/>
+      </w:pPr>
+      <w:rPr>
+        <w:rFonts w:ascii="Wingdings" w:hAnsi="Wingdings" w:hint="default"/>
+      </w:rPr>
+    </w:lvl>
+    <w:lvl w:ilvl="6" w:tplc="40090001" w:tentative="1">
+      <w:start w:val="1"/>
+      <w:numFmt w:val="bullet"/>
+      <w:lvlText w:val=""/>
+      <w:lvlJc w:val="left"/>
+      <w:pPr>
+        <w:ind w:left="6132" w:hanging="360"/>
+      </w:pPr>
+      <w:rPr>
+        <w:rFonts w:ascii="Symbol" w:hAnsi="Symbol" w:hint="default"/>
+      </w:rPr>
+    </w:lvl>
+    <w:lvl w:ilvl="7" w:tplc="40090003" w:tentative="1">
+      <w:start w:val="1"/>
+      <w:numFmt w:val="bullet"/>
+      <w:lvlText w:val="o"/>
+      <w:lvlJc w:val="left"/>
+      <w:pPr>
+        <w:ind w:left="6852" w:hanging="360"/>
+      </w:pPr>
+      <w:rPr>
+        <w:rFonts w:ascii="Courier New" w:hAnsi="Courier New" w:cs="Courier New" w:hint="default"/>
+      </w:rPr>
+    </w:lvl>
+    <w:lvl w:ilvl="8" w:tplc="40090005" w:tentative="1">
+      <w:start w:val="1"/>
+      <w:numFmt w:val="bullet"/>
+      <w:lvlText w:val=""/>
+      <w:lvlJc w:val="left"/>
+      <w:pPr>
+        <w:ind w:left="7572" w:hanging="360"/>
+      </w:pPr>
+      <w:rPr>
+        <w:rFonts w:ascii="Wingdings" w:hAnsi="Wingdings" w:hint="default"/>
+      </w:rPr>
+    </w:lvl>
+  </w:abstractNum>
+  <w:abstractNum w:abstractNumId="9" w15:restartNumberingAfterBreak="0">
+    <w:nsid w:val="44FD6A5D"/>
+    <w:multiLevelType w:val="hybridMultilevel"/>
+    <w:tmpl w:val="8B524D06"/>
+    <w:lvl w:ilvl="0" w:tplc="4009000B">
+      <w:start w:val="1"/>
+      <w:numFmt w:val="bullet"/>
+      <w:lvlText w:val=""/>
+      <w:lvlJc w:val="left"/>
+      <w:pPr>
+        <w:ind w:left="1908" w:hanging="360"/>
+      </w:pPr>
+      <w:rPr>
+        <w:rFonts w:ascii="Wingdings" w:hAnsi="Wingdings" w:hint="default"/>
+      </w:rPr>
+    </w:lvl>
+    <w:lvl w:ilvl="1" w:tplc="40090003" w:tentative="1">
+      <w:start w:val="1"/>
+      <w:numFmt w:val="bullet"/>
+      <w:lvlText w:val="o"/>
+      <w:lvlJc w:val="left"/>
+      <w:pPr>
+        <w:ind w:left="2628" w:hanging="360"/>
+      </w:pPr>
+      <w:rPr>
+        <w:rFonts w:ascii="Courier New" w:hAnsi="Courier New" w:cs="Courier New" w:hint="default"/>
+      </w:rPr>
+    </w:lvl>
+    <w:lvl w:ilvl="2" w:tplc="40090005" w:tentative="1">
+      <w:start w:val="1"/>
+      <w:numFmt w:val="bullet"/>
+      <w:lvlText w:val=""/>
+      <w:lvlJc w:val="left"/>
+      <w:pPr>
+        <w:ind w:left="3348" w:hanging="360"/>
+      </w:pPr>
+      <w:rPr>
+        <w:rFonts w:ascii="Wingdings" w:hAnsi="Wingdings" w:hint="default"/>
+      </w:rPr>
+    </w:lvl>
+    <w:lvl w:ilvl="3" w:tplc="40090001" w:tentative="1">
+      <w:start w:val="1"/>
+      <w:numFmt w:val="bullet"/>
+      <w:lvlText w:val=""/>
+      <w:lvlJc w:val="left"/>
+      <w:pPr>
+        <w:ind w:left="4068" w:hanging="360"/>
+      </w:pPr>
+      <w:rPr>
+        <w:rFonts w:ascii="Symbol" w:hAnsi="Symbol" w:hint="default"/>
+      </w:rPr>
+    </w:lvl>
+    <w:lvl w:ilvl="4" w:tplc="40090003" w:tentative="1">
+      <w:start w:val="1"/>
+      <w:numFmt w:val="bullet"/>
+      <w:lvlText w:val="o"/>
+      <w:lvlJc w:val="left"/>
+      <w:pPr>
+        <w:ind w:left="4788" w:hanging="360"/>
+      </w:pPr>
+      <w:rPr>
+        <w:rFonts w:ascii="Courier New" w:hAnsi="Courier New" w:cs="Courier New" w:hint="default"/>
+      </w:rPr>
+    </w:lvl>
+    <w:lvl w:ilvl="5" w:tplc="40090005" w:tentative="1">
+      <w:start w:val="1"/>
+      <w:numFmt w:val="bullet"/>
+      <w:lvlText w:val=""/>
+      <w:lvlJc w:val="left"/>
+      <w:pPr>
+        <w:ind w:left="5508" w:hanging="360"/>
+      </w:pPr>
+      <w:rPr>
+        <w:rFonts w:ascii="Wingdings" w:hAnsi="Wingdings" w:hint="default"/>
+      </w:rPr>
+    </w:lvl>
+    <w:lvl w:ilvl="6" w:tplc="40090001" w:tentative="1">
+      <w:start w:val="1"/>
+      <w:numFmt w:val="bullet"/>
+      <w:lvlText w:val=""/>
+      <w:lvlJc w:val="left"/>
+      <w:pPr>
+        <w:ind w:left="6228" w:hanging="360"/>
+      </w:pPr>
+      <w:rPr>
+        <w:rFonts w:ascii="Symbol" w:hAnsi="Symbol" w:hint="default"/>
+      </w:rPr>
+    </w:lvl>
+    <w:lvl w:ilvl="7" w:tplc="40090003" w:tentative="1">
+      <w:start w:val="1"/>
+      <w:numFmt w:val="bullet"/>
+      <w:lvlText w:val="o"/>
+      <w:lvlJc w:val="left"/>
+      <w:pPr>
+        <w:ind w:left="6948" w:hanging="360"/>
+      </w:pPr>
+      <w:rPr>
+        <w:rFonts w:ascii="Courier New" w:hAnsi="Courier New" w:cs="Courier New" w:hint="default"/>
+      </w:rPr>
+    </w:lvl>
+    <w:lvl w:ilvl="8" w:tplc="40090005" w:tentative="1">
+      <w:start w:val="1"/>
+      <w:numFmt w:val="bullet"/>
+      <w:lvlText w:val=""/>
+      <w:lvlJc w:val="left"/>
+      <w:pPr>
+        <w:ind w:left="7668" w:hanging="360"/>
+      </w:pPr>
+      <w:rPr>
+        <w:rFonts w:ascii="Wingdings" w:hAnsi="Wingdings" w:hint="default"/>
+      </w:rPr>
+    </w:lvl>
+  </w:abstractNum>
+  <w:abstractNum w:abstractNumId="10" w15:restartNumberingAfterBreak="0">
+    <w:nsid w:val="4A402F96"/>
+    <w:multiLevelType w:val="hybridMultilevel"/>
+    <w:tmpl w:val="AA30A896"/>
+    <w:lvl w:ilvl="0" w:tplc="4009000D">
+      <w:start w:val="1"/>
+      <w:numFmt w:val="bullet"/>
+      <w:lvlText w:val=""/>
+      <w:lvlJc w:val="left"/>
+      <w:pPr>
+        <w:ind w:left="720" w:hanging="360"/>
+      </w:pPr>
+      <w:rPr>
+        <w:rFonts w:ascii="Wingdings" w:hAnsi="Wingdings" w:hint="default"/>
+      </w:rPr>
+    </w:lvl>
+    <w:lvl w:ilvl="1" w:tplc="40090003">
+      <w:start w:val="1"/>
+      <w:numFmt w:val="bullet"/>
+      <w:lvlText w:val="o"/>
+      <w:lvlJc w:val="left"/>
+      <w:pPr>
+        <w:ind w:left="1440" w:hanging="360"/>
+      </w:pPr>
+      <w:rPr>
+        <w:rFonts w:ascii="Courier New" w:hAnsi="Courier New" w:cs="Courier New" w:hint="default"/>
+      </w:rPr>
+    </w:lvl>
+    <w:lvl w:ilvl="2" w:tplc="40090005" w:tentative="1">
+      <w:start w:val="1"/>
+      <w:numFmt w:val="bullet"/>
+      <w:lvlText w:val=""/>
+      <w:lvlJc w:val="left"/>
+      <w:pPr>
+        <w:ind w:left="2160" w:hanging="360"/>
+      </w:pPr>
+      <w:rPr>
+        <w:rFonts w:ascii="Wingdings" w:hAnsi="Wingdings" w:hint="default"/>
+      </w:rPr>
+    </w:lvl>
+    <w:lvl w:ilvl="3" w:tplc="40090001" w:tentative="1">
+      <w:start w:val="1"/>
+      <w:numFmt w:val="bullet"/>
+      <w:lvlText w:val=""/>
+      <w:lvlJc w:val="left"/>
+      <w:pPr>
+        <w:ind w:left="2880" w:hanging="360"/>
+      </w:pPr>
+      <w:rPr>
+        <w:rFonts w:ascii="Symbol" w:hAnsi="Symbol" w:hint="default"/>
+      </w:rPr>
+    </w:lvl>
+    <w:lvl w:ilvl="4" w:tplc="40090003" w:tentative="1">
+      <w:start w:val="1"/>
+      <w:numFmt w:val="bullet"/>
+      <w:lvlText w:val="o"/>
+      <w:lvlJc w:val="left"/>
+      <w:pPr>
+        <w:ind w:left="3600" w:hanging="360"/>
+      </w:pPr>
+      <w:rPr>
+        <w:rFonts w:ascii="Courier New" w:hAnsi="Courier New" w:cs="Courier New" w:hint="default"/>
+      </w:rPr>
+    </w:lvl>
+    <w:lvl w:ilvl="5" w:tplc="40090005" w:tentative="1">
+      <w:start w:val="1"/>
+      <w:numFmt w:val="bullet"/>
+      <w:lvlText w:val=""/>
+      <w:lvlJc w:val="left"/>
+      <w:pPr>
+        <w:ind w:left="4320" w:hanging="360"/>
+      </w:pPr>
+      <w:rPr>
+        <w:rFonts w:ascii="Wingdings" w:hAnsi="Wingdings" w:hint="default"/>
+      </w:rPr>
+    </w:lvl>
+    <w:lvl w:ilvl="6" w:tplc="40090001" w:tentative="1">
+      <w:start w:val="1"/>
+      <w:numFmt w:val="bullet"/>
+      <w:lvlText w:val=""/>
+      <w:lvlJc w:val="left"/>
+      <w:pPr>
+        <w:ind w:left="5040" w:hanging="360"/>
+      </w:pPr>
+      <w:rPr>
+        <w:rFonts w:ascii="Symbol" w:hAnsi="Symbol" w:hint="default"/>
+      </w:rPr>
+    </w:lvl>
+    <w:lvl w:ilvl="7" w:tplc="40090003" w:tentative="1">
+      <w:start w:val="1"/>
+      <w:numFmt w:val="bullet"/>
+      <w:lvlText w:val="o"/>
+      <w:lvlJc w:val="left"/>
+      <w:pPr>
+        <w:ind w:left="5760" w:hanging="360"/>
+      </w:pPr>
+      <w:rPr>
+        <w:rFonts w:ascii="Courier New" w:hAnsi="Courier New" w:cs="Courier New" w:hint="default"/>
+      </w:rPr>
+    </w:lvl>
+    <w:lvl w:ilvl="8" w:tplc="40090005" w:tentative="1">
+      <w:start w:val="1"/>
+      <w:numFmt w:val="bullet"/>
+      <w:lvlText w:val=""/>
+      <w:lvlJc w:val="left"/>
+      <w:pPr>
+        <w:ind w:left="6480" w:hanging="360"/>
+      </w:pPr>
+      <w:rPr>
+        <w:rFonts w:ascii="Wingdings" w:hAnsi="Wingdings" w:hint="default"/>
+      </w:rPr>
+    </w:lvl>
+  </w:abstractNum>
+  <w:abstractNum w:abstractNumId="11" w15:restartNumberingAfterBreak="0">
     <w:nsid w:val="5E17516D"/>
     <w:multiLevelType w:val="hybridMultilevel"/>
     <w:tmpl w:val="15EEB1D8"/>
@@ -2045,7 +2683,7 @@
       </w:pPr>
     </w:lvl>
   </w:abstractNum>
-  <w:abstractNum w:abstractNumId="8" w15:restartNumberingAfterBreak="0">
+  <w:abstractNum w:abstractNumId="12" w15:restartNumberingAfterBreak="0">
     <w:nsid w:val="66CD1861"/>
     <w:multiLevelType w:val="hybridMultilevel"/>
     <w:tmpl w:val="FED8380A"/>
@@ -2158,17 +2796,243 @@
       </w:rPr>
     </w:lvl>
   </w:abstractNum>
+  <w:abstractNum w:abstractNumId="13" w15:restartNumberingAfterBreak="0">
+    <w:nsid w:val="6E504E39"/>
+    <w:multiLevelType w:val="hybridMultilevel"/>
+    <w:tmpl w:val="67E672CE"/>
+    <w:lvl w:ilvl="0" w:tplc="4009000B">
+      <w:start w:val="1"/>
+      <w:numFmt w:val="bullet"/>
+      <w:lvlText w:val=""/>
+      <w:lvlJc w:val="left"/>
+      <w:pPr>
+        <w:ind w:left="1764" w:hanging="360"/>
+      </w:pPr>
+      <w:rPr>
+        <w:rFonts w:ascii="Wingdings" w:hAnsi="Wingdings" w:hint="default"/>
+      </w:rPr>
+    </w:lvl>
+    <w:lvl w:ilvl="1" w:tplc="40090003" w:tentative="1">
+      <w:start w:val="1"/>
+      <w:numFmt w:val="bullet"/>
+      <w:lvlText w:val="o"/>
+      <w:lvlJc w:val="left"/>
+      <w:pPr>
+        <w:ind w:left="2484" w:hanging="360"/>
+      </w:pPr>
+      <w:rPr>
+        <w:rFonts w:ascii="Courier New" w:hAnsi="Courier New" w:cs="Courier New" w:hint="default"/>
+      </w:rPr>
+    </w:lvl>
+    <w:lvl w:ilvl="2" w:tplc="40090005" w:tentative="1">
+      <w:start w:val="1"/>
+      <w:numFmt w:val="bullet"/>
+      <w:lvlText w:val=""/>
+      <w:lvlJc w:val="left"/>
+      <w:pPr>
+        <w:ind w:left="3204" w:hanging="360"/>
+      </w:pPr>
+      <w:rPr>
+        <w:rFonts w:ascii="Wingdings" w:hAnsi="Wingdings" w:hint="default"/>
+      </w:rPr>
+    </w:lvl>
+    <w:lvl w:ilvl="3" w:tplc="40090001" w:tentative="1">
+      <w:start w:val="1"/>
+      <w:numFmt w:val="bullet"/>
+      <w:lvlText w:val=""/>
+      <w:lvlJc w:val="left"/>
+      <w:pPr>
+        <w:ind w:left="3924" w:hanging="360"/>
+      </w:pPr>
+      <w:rPr>
+        <w:rFonts w:ascii="Symbol" w:hAnsi="Symbol" w:hint="default"/>
+      </w:rPr>
+    </w:lvl>
+    <w:lvl w:ilvl="4" w:tplc="40090003" w:tentative="1">
+      <w:start w:val="1"/>
+      <w:numFmt w:val="bullet"/>
+      <w:lvlText w:val="o"/>
+      <w:lvlJc w:val="left"/>
+      <w:pPr>
+        <w:ind w:left="4644" w:hanging="360"/>
+      </w:pPr>
+      <w:rPr>
+        <w:rFonts w:ascii="Courier New" w:hAnsi="Courier New" w:cs="Courier New" w:hint="default"/>
+      </w:rPr>
+    </w:lvl>
+    <w:lvl w:ilvl="5" w:tplc="40090005" w:tentative="1">
+      <w:start w:val="1"/>
+      <w:numFmt w:val="bullet"/>
+      <w:lvlText w:val=""/>
+      <w:lvlJc w:val="left"/>
+      <w:pPr>
+        <w:ind w:left="5364" w:hanging="360"/>
+      </w:pPr>
+      <w:rPr>
+        <w:rFonts w:ascii="Wingdings" w:hAnsi="Wingdings" w:hint="default"/>
+      </w:rPr>
+    </w:lvl>
+    <w:lvl w:ilvl="6" w:tplc="40090001" w:tentative="1">
+      <w:start w:val="1"/>
+      <w:numFmt w:val="bullet"/>
+      <w:lvlText w:val=""/>
+      <w:lvlJc w:val="left"/>
+      <w:pPr>
+        <w:ind w:left="6084" w:hanging="360"/>
+      </w:pPr>
+      <w:rPr>
+        <w:rFonts w:ascii="Symbol" w:hAnsi="Symbol" w:hint="default"/>
+      </w:rPr>
+    </w:lvl>
+    <w:lvl w:ilvl="7" w:tplc="40090003" w:tentative="1">
+      <w:start w:val="1"/>
+      <w:numFmt w:val="bullet"/>
+      <w:lvlText w:val="o"/>
+      <w:lvlJc w:val="left"/>
+      <w:pPr>
+        <w:ind w:left="6804" w:hanging="360"/>
+      </w:pPr>
+      <w:rPr>
+        <w:rFonts w:ascii="Courier New" w:hAnsi="Courier New" w:cs="Courier New" w:hint="default"/>
+      </w:rPr>
+    </w:lvl>
+    <w:lvl w:ilvl="8" w:tplc="40090005" w:tentative="1">
+      <w:start w:val="1"/>
+      <w:numFmt w:val="bullet"/>
+      <w:lvlText w:val=""/>
+      <w:lvlJc w:val="left"/>
+      <w:pPr>
+        <w:ind w:left="7524" w:hanging="360"/>
+      </w:pPr>
+      <w:rPr>
+        <w:rFonts w:ascii="Wingdings" w:hAnsi="Wingdings" w:hint="default"/>
+      </w:rPr>
+    </w:lvl>
+  </w:abstractNum>
+  <w:abstractNum w:abstractNumId="14" w15:restartNumberingAfterBreak="0">
+    <w:nsid w:val="785C2E3E"/>
+    <w:multiLevelType w:val="hybridMultilevel"/>
+    <w:tmpl w:val="7BC4920E"/>
+    <w:lvl w:ilvl="0" w:tplc="4009000B">
+      <w:start w:val="1"/>
+      <w:numFmt w:val="bullet"/>
+      <w:lvlText w:val=""/>
+      <w:lvlJc w:val="left"/>
+      <w:pPr>
+        <w:ind w:left="1464" w:hanging="360"/>
+      </w:pPr>
+      <w:rPr>
+        <w:rFonts w:ascii="Wingdings" w:hAnsi="Wingdings" w:hint="default"/>
+      </w:rPr>
+    </w:lvl>
+    <w:lvl w:ilvl="1" w:tplc="40090003" w:tentative="1">
+      <w:start w:val="1"/>
+      <w:numFmt w:val="bullet"/>
+      <w:lvlText w:val="o"/>
+      <w:lvlJc w:val="left"/>
+      <w:pPr>
+        <w:ind w:left="2184" w:hanging="360"/>
+      </w:pPr>
+      <w:rPr>
+        <w:rFonts w:ascii="Courier New" w:hAnsi="Courier New" w:cs="Courier New" w:hint="default"/>
+      </w:rPr>
+    </w:lvl>
+    <w:lvl w:ilvl="2" w:tplc="40090005" w:tentative="1">
+      <w:start w:val="1"/>
+      <w:numFmt w:val="bullet"/>
+      <w:lvlText w:val=""/>
+      <w:lvlJc w:val="left"/>
+      <w:pPr>
+        <w:ind w:left="2904" w:hanging="360"/>
+      </w:pPr>
+      <w:rPr>
+        <w:rFonts w:ascii="Wingdings" w:hAnsi="Wingdings" w:hint="default"/>
+      </w:rPr>
+    </w:lvl>
+    <w:lvl w:ilvl="3" w:tplc="40090001" w:tentative="1">
+      <w:start w:val="1"/>
+      <w:numFmt w:val="bullet"/>
+      <w:lvlText w:val=""/>
+      <w:lvlJc w:val="left"/>
+      <w:pPr>
+        <w:ind w:left="3624" w:hanging="360"/>
+      </w:pPr>
+      <w:rPr>
+        <w:rFonts w:ascii="Symbol" w:hAnsi="Symbol" w:hint="default"/>
+      </w:rPr>
+    </w:lvl>
+    <w:lvl w:ilvl="4" w:tplc="40090003" w:tentative="1">
+      <w:start w:val="1"/>
+      <w:numFmt w:val="bullet"/>
+      <w:lvlText w:val="o"/>
+      <w:lvlJc w:val="left"/>
+      <w:pPr>
+        <w:ind w:left="4344" w:hanging="360"/>
+      </w:pPr>
+      <w:rPr>
+        <w:rFonts w:ascii="Courier New" w:hAnsi="Courier New" w:cs="Courier New" w:hint="default"/>
+      </w:rPr>
+    </w:lvl>
+    <w:lvl w:ilvl="5" w:tplc="40090005" w:tentative="1">
+      <w:start w:val="1"/>
+      <w:numFmt w:val="bullet"/>
+      <w:lvlText w:val=""/>
+      <w:lvlJc w:val="left"/>
+      <w:pPr>
+        <w:ind w:left="5064" w:hanging="360"/>
+      </w:pPr>
+      <w:rPr>
+        <w:rFonts w:ascii="Wingdings" w:hAnsi="Wingdings" w:hint="default"/>
+      </w:rPr>
+    </w:lvl>
+    <w:lvl w:ilvl="6" w:tplc="40090001" w:tentative="1">
+      <w:start w:val="1"/>
+      <w:numFmt w:val="bullet"/>
+      <w:lvlText w:val=""/>
+      <w:lvlJc w:val="left"/>
+      <w:pPr>
+        <w:ind w:left="5784" w:hanging="360"/>
+      </w:pPr>
+      <w:rPr>
+        <w:rFonts w:ascii="Symbol" w:hAnsi="Symbol" w:hint="default"/>
+      </w:rPr>
+    </w:lvl>
+    <w:lvl w:ilvl="7" w:tplc="40090003" w:tentative="1">
+      <w:start w:val="1"/>
+      <w:numFmt w:val="bullet"/>
+      <w:lvlText w:val="o"/>
+      <w:lvlJc w:val="left"/>
+      <w:pPr>
+        <w:ind w:left="6504" w:hanging="360"/>
+      </w:pPr>
+      <w:rPr>
+        <w:rFonts w:ascii="Courier New" w:hAnsi="Courier New" w:cs="Courier New" w:hint="default"/>
+      </w:rPr>
+    </w:lvl>
+    <w:lvl w:ilvl="8" w:tplc="40090005" w:tentative="1">
+      <w:start w:val="1"/>
+      <w:numFmt w:val="bullet"/>
+      <w:lvlText w:val=""/>
+      <w:lvlJc w:val="left"/>
+      <w:pPr>
+        <w:ind w:left="7224" w:hanging="360"/>
+      </w:pPr>
+      <w:rPr>
+        <w:rFonts w:ascii="Wingdings" w:hAnsi="Wingdings" w:hint="default"/>
+      </w:rPr>
+    </w:lvl>
+  </w:abstractNum>
   <w:num w:numId="1" w16cid:durableId="1822039701">
-    <w:abstractNumId w:val="8"/>
+    <w:abstractNumId w:val="12"/>
   </w:num>
   <w:num w:numId="2" w16cid:durableId="1020425087">
-    <w:abstractNumId w:val="6"/>
+    <w:abstractNumId w:val="7"/>
   </w:num>
   <w:num w:numId="3" w16cid:durableId="1835603258">
     <w:abstractNumId w:val="1"/>
   </w:num>
   <w:num w:numId="4" w16cid:durableId="1586497649">
-    <w:abstractNumId w:val="7"/>
+    <w:abstractNumId w:val="11"/>
   </w:num>
   <w:num w:numId="5" w16cid:durableId="1824850840">
     <w:abstractNumId w:val="5"/>
@@ -2184,6 +3048,24 @@
   </w:num>
   <w:num w:numId="9" w16cid:durableId="579486931">
     <w:abstractNumId w:val="3"/>
+  </w:num>
+  <w:num w:numId="10" w16cid:durableId="1734816051">
+    <w:abstractNumId w:val="6"/>
+  </w:num>
+  <w:num w:numId="11" w16cid:durableId="2044864572">
+    <w:abstractNumId w:val="9"/>
+  </w:num>
+  <w:num w:numId="12" w16cid:durableId="1772360497">
+    <w:abstractNumId w:val="13"/>
+  </w:num>
+  <w:num w:numId="13" w16cid:durableId="208761631">
+    <w:abstractNumId w:val="8"/>
+  </w:num>
+  <w:num w:numId="14" w16cid:durableId="1179587731">
+    <w:abstractNumId w:val="14"/>
+  </w:num>
+  <w:num w:numId="15" w16cid:durableId="2046830032">
+    <w:abstractNumId w:val="10"/>
   </w:num>
 </w:numbering>
 </file>

</xml_diff>

<commit_message>
Added roadmap for devops
</commit_message>
<xml_diff>
--- a/GIT.docx
+++ b/GIT.docx
@@ -1657,26 +1657,315 @@
     <w:p>
       <w:pPr>
         <w:pStyle w:val="ListParagraph"/>
-      </w:pPr>
-    </w:p>
-    <w:p>
-      <w:pPr>
-        <w:pStyle w:val="ListParagraph"/>
-      </w:pPr>
-      <w:r>
-        <w:t xml:space="preserve">               </w:t>
-      </w:r>
-    </w:p>
-    <w:p/>
-    <w:p>
-      <w:r>
+        <w:numPr>
+          <w:ilvl w:val="0"/>
+          <w:numId w:val="1"/>
+        </w:numPr>
+      </w:pPr>
+      <w:r>
+        <w:t>When multiple teams working on same repo then project delivery will become difficult.</w:t>
+      </w:r>
+    </w:p>
+    <w:p>
+      <w:pPr>
+        <w:pStyle w:val="ListParagraph"/>
+        <w:numPr>
+          <w:ilvl w:val="0"/>
+          <w:numId w:val="1"/>
+        </w:numPr>
+      </w:pPr>
+      <w:r>
+        <w:t>To make our project delivery process simple, we need to maintain multiple branches in git hub repo.</w:t>
+      </w:r>
+    </w:p>
+    <w:p>
+      <w:pPr>
+        <w:ind w:left="360"/>
         <w:rPr>
           <w:b/>
           <w:bCs/>
         </w:rPr>
+      </w:pPr>
+      <w:r>
+        <w:rPr>
+          <w:b/>
+          <w:bCs/>
+          <w:highlight w:val="green"/>
+        </w:rPr>
+        <w:t>NOTE: For every team one git branch is recommended.</w:t>
+      </w:r>
+    </w:p>
+    <w:p>
+      <w:pPr>
+        <w:pStyle w:val="ListParagraph"/>
+        <w:numPr>
+          <w:ilvl w:val="0"/>
+          <w:numId w:val="1"/>
+        </w:numPr>
+      </w:pPr>
+      <w:r>
+        <w:t xml:space="preserve">By using branches, multiple teams can work </w:t>
+      </w:r>
+      <w:r>
+        <w:t>parallelly.</w:t>
+      </w:r>
+    </w:p>
+    <w:p>
+      <w:pPr>
+        <w:pStyle w:val="ListParagraph"/>
+      </w:pPr>
+    </w:p>
+    <w:p>
+      <w:pPr>
+        <w:pStyle w:val="ListParagraph"/>
+      </w:pPr>
+      <w:r>
+        <w:t>Development team =&gt; develop branch</w:t>
+      </w:r>
+    </w:p>
+    <w:p>
+      <w:pPr>
+        <w:pStyle w:val="ListParagraph"/>
+      </w:pPr>
+      <w:r>
+        <w:t>Bug fixing team =&gt; sit branch</w:t>
+      </w:r>
+    </w:p>
+    <w:p>
+      <w:pPr>
+        <w:pStyle w:val="ListParagraph"/>
+      </w:pPr>
+      <w:r>
+        <w:lastRenderedPageBreak/>
+        <w:t>R &amp;D team =&gt; research branch</w:t>
+      </w:r>
+    </w:p>
+    <w:p>
+      <w:pPr>
+        <w:pStyle w:val="ListParagraph"/>
+      </w:pPr>
+      <w:r>
+        <w:t>Prod team =&gt; release branch</w:t>
+      </w:r>
+    </w:p>
+    <w:p>
+      <w:pPr>
+        <w:pStyle w:val="ListParagraph"/>
+      </w:pPr>
+    </w:p>
+    <w:p>
+      <w:pPr>
+        <w:pStyle w:val="ListParagraph"/>
+      </w:pPr>
+      <w:r>
+        <w:drawing>
+          <wp:inline distT="0" distB="0" distL="0" distR="0" wp14:anchorId="0C5A3D8A" wp14:editId="7CF78ECD">
+            <wp:extent cx="5534797" cy="3086531"/>
+            <wp:effectExtent l="0" t="0" r="0" b="0"/>
+            <wp:docPr id="1547822142" name="Picture 1"/>
+            <wp:cNvGraphicFramePr>
+              <a:graphicFrameLocks xmlns:a="http://schemas.openxmlformats.org/drawingml/2006/main" noChangeAspect="1"/>
+            </wp:cNvGraphicFramePr>
+            <a:graphic xmlns:a="http://schemas.openxmlformats.org/drawingml/2006/main">
+              <a:graphicData uri="http://schemas.openxmlformats.org/drawingml/2006/picture">
+                <pic:pic xmlns:pic="http://schemas.openxmlformats.org/drawingml/2006/picture">
+                  <pic:nvPicPr>
+                    <pic:cNvPr id="1547822142" name=""/>
+                    <pic:cNvPicPr/>
+                  </pic:nvPicPr>
+                  <pic:blipFill>
+                    <a:blip r:embed="rId14"/>
+                    <a:stretch>
+                      <a:fillRect/>
+                    </a:stretch>
+                  </pic:blipFill>
+                  <pic:spPr>
+                    <a:xfrm>
+                      <a:off x="0" y="0"/>
+                      <a:ext cx="5534797" cy="3086531"/>
+                    </a:xfrm>
+                    <a:prstGeom prst="rect">
+                      <a:avLst/>
+                    </a:prstGeom>
+                  </pic:spPr>
+                </pic:pic>
+              </a:graphicData>
+            </a:graphic>
+          </wp:inline>
+        </w:drawing>
+      </w:r>
+      <w:r>
         <w:br/>
       </w:r>
     </w:p>
+    <w:p>
+      <w:pPr>
+        <w:pStyle w:val="ListParagraph"/>
+      </w:pPr>
+    </w:p>
+    <w:p>
+      <w:pPr>
+        <w:pStyle w:val="ListParagraph"/>
+      </w:pPr>
+      <w:r>
+        <w:t xml:space="preserve">              </w:t>
+      </w:r>
+    </w:p>
+    <w:p/>
+    <w:p>
+      <w:pPr>
+        <w:rPr>
+          <w:b/>
+          <w:bCs/>
+        </w:rPr>
+      </w:pPr>
+      <w:r>
+        <w:rPr>
+          <w:b/>
+          <w:bCs/>
+          <w:highlight w:val="yellow"/>
+        </w:rPr>
+        <w:t>LAB TASK:</w:t>
+      </w:r>
+    </w:p>
+    <w:p>
+      <w:pPr>
+        <w:pStyle w:val="ListParagraph"/>
+        <w:numPr>
+          <w:ilvl w:val="0"/>
+          <w:numId w:val="17"/>
+        </w:numPr>
+      </w:pPr>
+      <w:r>
+        <w:t>Go to git hub repository and create develop branch from main branch.</w:t>
+      </w:r>
+    </w:p>
+    <w:p>
+      <w:pPr>
+        <w:pStyle w:val="ListParagraph"/>
+        <w:numPr>
+          <w:ilvl w:val="0"/>
+          <w:numId w:val="17"/>
+        </w:numPr>
+      </w:pPr>
+      <w:r>
+        <w:t>Clone git repo (by default main branch will come)</w:t>
+      </w:r>
+    </w:p>
+    <w:p>
+      <w:pPr>
+        <w:pStyle w:val="ListParagraph"/>
+      </w:pPr>
+      <w:r>
+        <w:t xml:space="preserve">                 Eg: git clone &lt;</w:t>
+      </w:r>
+      <w:proofErr w:type="spellStart"/>
+      <w:r>
+        <w:t>url</w:t>
+      </w:r>
+      <w:proofErr w:type="spellEnd"/>
+      <w:r>
+        <w:t>&gt;</w:t>
+      </w:r>
+    </w:p>
+    <w:p>
+      <w:pPr>
+        <w:pStyle w:val="ListParagraph"/>
+        <w:numPr>
+          <w:ilvl w:val="0"/>
+          <w:numId w:val="17"/>
+        </w:numPr>
+      </w:pPr>
+      <w:r>
+        <w:t>Switch from main to develop</w:t>
+      </w:r>
+    </w:p>
+    <w:p>
+      <w:pPr>
+        <w:pStyle w:val="ListParagraph"/>
+      </w:pPr>
+      <w:r>
+        <w:t xml:space="preserve">                  Eg: git checkout </w:t>
+      </w:r>
+      <w:proofErr w:type="gramStart"/>
+      <w:r>
+        <w:t>develop</w:t>
+      </w:r>
+      <w:proofErr w:type="gramEnd"/>
+    </w:p>
+    <w:p>
+      <w:pPr>
+        <w:pStyle w:val="ListParagraph"/>
+        <w:numPr>
+          <w:ilvl w:val="0"/>
+          <w:numId w:val="17"/>
+        </w:numPr>
+      </w:pPr>
+      <w:r>
+        <w:t>Create a file and push to develop branch</w:t>
+      </w:r>
+    </w:p>
+    <w:p>
+      <w:pPr>
+        <w:pStyle w:val="ListParagraph"/>
+        <w:numPr>
+          <w:ilvl w:val="0"/>
+          <w:numId w:val="17"/>
+        </w:numPr>
+      </w:pPr>
+      <w:r>
+        <w:t>Create pull request and merge develop branch changes to main branch.</w:t>
+      </w:r>
+    </w:p>
+    <w:p>
+      <w:r>
+        <w:rPr>
+          <w:b/>
+          <w:bCs/>
+        </w:rPr>
+        <w:lastRenderedPageBreak/>
+        <w:br/>
+      </w:r>
+      <w:r>
+        <w:drawing>
+          <wp:inline distT="0" distB="0" distL="0" distR="0" wp14:anchorId="6D2EC52F" wp14:editId="364F9B01">
+            <wp:extent cx="5496692" cy="2781688"/>
+            <wp:effectExtent l="0" t="0" r="8890" b="0"/>
+            <wp:docPr id="190080824" name="Picture 1"/>
+            <wp:cNvGraphicFramePr>
+              <a:graphicFrameLocks xmlns:a="http://schemas.openxmlformats.org/drawingml/2006/main" noChangeAspect="1"/>
+            </wp:cNvGraphicFramePr>
+            <a:graphic xmlns:a="http://schemas.openxmlformats.org/drawingml/2006/main">
+              <a:graphicData uri="http://schemas.openxmlformats.org/drawingml/2006/picture">
+                <pic:pic xmlns:pic="http://schemas.openxmlformats.org/drawingml/2006/picture">
+                  <pic:nvPicPr>
+                    <pic:cNvPr id="190080824" name=""/>
+                    <pic:cNvPicPr/>
+                  </pic:nvPicPr>
+                  <pic:blipFill>
+                    <a:blip r:embed="rId15"/>
+                    <a:stretch>
+                      <a:fillRect/>
+                    </a:stretch>
+                  </pic:blipFill>
+                  <pic:spPr>
+                    <a:xfrm>
+                      <a:off x="0" y="0"/>
+                      <a:ext cx="5496692" cy="2781688"/>
+                    </a:xfrm>
+                    <a:prstGeom prst="rect">
+                      <a:avLst/>
+                    </a:prstGeom>
+                  </pic:spPr>
+                </pic:pic>
+              </a:graphicData>
+            </a:graphic>
+          </wp:inline>
+        </w:drawing>
+      </w:r>
+    </w:p>
+    <w:p/>
+    <w:p/>
     <w:p/>
     <w:p/>
     <w:p/>
@@ -3066,6 +3355,95 @@
     </w:lvl>
   </w:abstractNum>
   <w:abstractNum w:abstractNumId="13" w15:restartNumberingAfterBreak="0">
+    <w:nsid w:val="5F5338C2"/>
+    <w:multiLevelType w:val="hybridMultilevel"/>
+    <w:tmpl w:val="C750BF2C"/>
+    <w:lvl w:ilvl="0" w:tplc="4009000F">
+      <w:start w:val="1"/>
+      <w:numFmt w:val="decimal"/>
+      <w:lvlText w:val="%1."/>
+      <w:lvlJc w:val="left"/>
+      <w:pPr>
+        <w:ind w:left="720" w:hanging="360"/>
+      </w:pPr>
+      <w:rPr>
+        <w:rFonts w:hint="default"/>
+      </w:rPr>
+    </w:lvl>
+    <w:lvl w:ilvl="1" w:tplc="40090019" w:tentative="1">
+      <w:start w:val="1"/>
+      <w:numFmt w:val="lowerLetter"/>
+      <w:lvlText w:val="%2."/>
+      <w:lvlJc w:val="left"/>
+      <w:pPr>
+        <w:ind w:left="1440" w:hanging="360"/>
+      </w:pPr>
+    </w:lvl>
+    <w:lvl w:ilvl="2" w:tplc="4009001B" w:tentative="1">
+      <w:start w:val="1"/>
+      <w:numFmt w:val="lowerRoman"/>
+      <w:lvlText w:val="%3."/>
+      <w:lvlJc w:val="right"/>
+      <w:pPr>
+        <w:ind w:left="2160" w:hanging="180"/>
+      </w:pPr>
+    </w:lvl>
+    <w:lvl w:ilvl="3" w:tplc="4009000F" w:tentative="1">
+      <w:start w:val="1"/>
+      <w:numFmt w:val="decimal"/>
+      <w:lvlText w:val="%4."/>
+      <w:lvlJc w:val="left"/>
+      <w:pPr>
+        <w:ind w:left="2880" w:hanging="360"/>
+      </w:pPr>
+    </w:lvl>
+    <w:lvl w:ilvl="4" w:tplc="40090019" w:tentative="1">
+      <w:start w:val="1"/>
+      <w:numFmt w:val="lowerLetter"/>
+      <w:lvlText w:val="%5."/>
+      <w:lvlJc w:val="left"/>
+      <w:pPr>
+        <w:ind w:left="3600" w:hanging="360"/>
+      </w:pPr>
+    </w:lvl>
+    <w:lvl w:ilvl="5" w:tplc="4009001B" w:tentative="1">
+      <w:start w:val="1"/>
+      <w:numFmt w:val="lowerRoman"/>
+      <w:lvlText w:val="%6."/>
+      <w:lvlJc w:val="right"/>
+      <w:pPr>
+        <w:ind w:left="4320" w:hanging="180"/>
+      </w:pPr>
+    </w:lvl>
+    <w:lvl w:ilvl="6" w:tplc="4009000F" w:tentative="1">
+      <w:start w:val="1"/>
+      <w:numFmt w:val="decimal"/>
+      <w:lvlText w:val="%7."/>
+      <w:lvlJc w:val="left"/>
+      <w:pPr>
+        <w:ind w:left="5040" w:hanging="360"/>
+      </w:pPr>
+    </w:lvl>
+    <w:lvl w:ilvl="7" w:tplc="40090019" w:tentative="1">
+      <w:start w:val="1"/>
+      <w:numFmt w:val="lowerLetter"/>
+      <w:lvlText w:val="%8."/>
+      <w:lvlJc w:val="left"/>
+      <w:pPr>
+        <w:ind w:left="5760" w:hanging="360"/>
+      </w:pPr>
+    </w:lvl>
+    <w:lvl w:ilvl="8" w:tplc="4009001B" w:tentative="1">
+      <w:start w:val="1"/>
+      <w:numFmt w:val="lowerRoman"/>
+      <w:lvlText w:val="%9."/>
+      <w:lvlJc w:val="right"/>
+      <w:pPr>
+        <w:ind w:left="6480" w:hanging="180"/>
+      </w:pPr>
+    </w:lvl>
+  </w:abstractNum>
+  <w:abstractNum w:abstractNumId="14" w15:restartNumberingAfterBreak="0">
     <w:nsid w:val="66CD1861"/>
     <w:multiLevelType w:val="hybridMultilevel"/>
     <w:tmpl w:val="7DF6CBEA"/>
@@ -3178,7 +3556,7 @@
       </w:rPr>
     </w:lvl>
   </w:abstractNum>
-  <w:abstractNum w:abstractNumId="14" w15:restartNumberingAfterBreak="0">
+  <w:abstractNum w:abstractNumId="15" w15:restartNumberingAfterBreak="0">
     <w:nsid w:val="6E504E39"/>
     <w:multiLevelType w:val="hybridMultilevel"/>
     <w:tmpl w:val="67E672CE"/>
@@ -3291,7 +3669,7 @@
       </w:rPr>
     </w:lvl>
   </w:abstractNum>
-  <w:abstractNum w:abstractNumId="15" w15:restartNumberingAfterBreak="0">
+  <w:abstractNum w:abstractNumId="16" w15:restartNumberingAfterBreak="0">
     <w:nsid w:val="785C2E3E"/>
     <w:multiLevelType w:val="hybridMultilevel"/>
     <w:tmpl w:val="7BC4920E"/>
@@ -3405,7 +3783,7 @@
     </w:lvl>
   </w:abstractNum>
   <w:num w:numId="1" w16cid:durableId="1822039701">
-    <w:abstractNumId w:val="13"/>
+    <w:abstractNumId w:val="14"/>
   </w:num>
   <w:num w:numId="2" w16cid:durableId="1020425087">
     <w:abstractNumId w:val="7"/>
@@ -3438,19 +3816,22 @@
     <w:abstractNumId w:val="9"/>
   </w:num>
   <w:num w:numId="12" w16cid:durableId="1772360497">
-    <w:abstractNumId w:val="14"/>
+    <w:abstractNumId w:val="15"/>
   </w:num>
   <w:num w:numId="13" w16cid:durableId="208761631">
     <w:abstractNumId w:val="8"/>
   </w:num>
   <w:num w:numId="14" w16cid:durableId="1179587731">
-    <w:abstractNumId w:val="15"/>
+    <w:abstractNumId w:val="16"/>
   </w:num>
   <w:num w:numId="15" w16cid:durableId="2046830032">
     <w:abstractNumId w:val="10"/>
   </w:num>
   <w:num w:numId="16" w16cid:durableId="1218517939">
     <w:abstractNumId w:val="11"/>
+  </w:num>
+  <w:num w:numId="17" w16cid:durableId="1580478462">
+    <w:abstractNumId w:val="13"/>
   </w:num>
 </w:numbering>
 </file>

</xml_diff>

<commit_message>
git Notes is updated and completed
</commit_message>
<xml_diff>
--- a/GIT.docx
+++ b/GIT.docx
@@ -69,6 +69,34 @@
       </w:pPr>
       <w:r>
         <w:t>GIT is version control software</w:t>
+      </w:r>
+      <w:r>
+        <w:t xml:space="preserve"> (which is used to code at one place</w:t>
+      </w:r>
+    </w:p>
+    <w:p>
+      <w:pPr>
+        <w:pStyle w:val="ListParagraph"/>
+        <w:numPr>
+          <w:ilvl w:val="0"/>
+          <w:numId w:val="19"/>
+        </w:numPr>
+      </w:pPr>
+      <w:r>
+        <w:rPr>
+          <w:b/>
+          <w:bCs/>
+        </w:rPr>
+        <w:t>version control software</w:t>
+      </w:r>
+      <w:r>
+        <w:t xml:space="preserve"> (which is used to integrate code at one place, which is going to </w:t>
+      </w:r>
+      <w:r>
+        <w:t xml:space="preserve">     </w:t>
+      </w:r>
+      <w:r>
+        <w:t>provide monitor access for you)</w:t>
       </w:r>
     </w:p>
     <w:p>
@@ -180,6 +208,7 @@
         <w:rPr>
           <w:noProof/>
         </w:rPr>
+        <w:lastRenderedPageBreak/>
         <w:drawing>
           <wp:inline distT="0" distB="0" distL="0" distR="0" wp14:anchorId="4A1087AE" wp14:editId="7731F460">
             <wp:extent cx="5191850" cy="3267531"/>
@@ -624,6 +653,7 @@
         </w:numPr>
       </w:pPr>
       <w:r>
+        <w:lastRenderedPageBreak/>
         <w:t>Project team members will connect with fit repository using the URL.</w:t>
       </w:r>
     </w:p>
@@ -1002,6 +1032,7 @@
           <w:b/>
           <w:bCs/>
         </w:rPr>
+        <w:lastRenderedPageBreak/>
         <w:t>git status:</w:t>
       </w:r>
       <w:r>
@@ -1279,7 +1310,6 @@
         <w:ind w:left="1464"/>
       </w:pPr>
       <w:r>
-        <w:lastRenderedPageBreak/>
         <w:t xml:space="preserve">Eg: </w:t>
       </w:r>
       <w:hyperlink r:id="rId13" w:history="1">
@@ -1736,28 +1766,75 @@
         <w:pStyle w:val="ListParagraph"/>
       </w:pPr>
       <w:r>
+        <w:t>R &amp;D team =&gt; research branch</w:t>
+      </w:r>
+    </w:p>
+    <w:p>
+      <w:pPr>
+        <w:pStyle w:val="ListParagraph"/>
+      </w:pPr>
+      <w:r>
+        <w:t>Prod team =&gt; release branch</w:t>
+      </w:r>
+    </w:p>
+    <w:p>
+      <w:pPr>
+        <w:pStyle w:val="ListParagraph"/>
+      </w:pPr>
+    </w:p>
+    <w:p>
+      <w:pPr>
+        <w:pStyle w:val="ListParagraph"/>
+      </w:pPr>
+      <w:r>
+        <w:drawing>
+          <wp:inline distT="0" distB="0" distL="0" distR="0" wp14:anchorId="48DCE025" wp14:editId="5C8FD64A">
+            <wp:extent cx="5534797" cy="3172268"/>
+            <wp:effectExtent l="0" t="0" r="0" b="9525"/>
+            <wp:docPr id="1883470349" name="Picture 1"/>
+            <wp:cNvGraphicFramePr>
+              <a:graphicFrameLocks xmlns:a="http://schemas.openxmlformats.org/drawingml/2006/main" noChangeAspect="1"/>
+            </wp:cNvGraphicFramePr>
+            <a:graphic xmlns:a="http://schemas.openxmlformats.org/drawingml/2006/main">
+              <a:graphicData uri="http://schemas.openxmlformats.org/drawingml/2006/picture">
+                <pic:pic xmlns:pic="http://schemas.openxmlformats.org/drawingml/2006/picture">
+                  <pic:nvPicPr>
+                    <pic:cNvPr id="1883470349" name=""/>
+                    <pic:cNvPicPr/>
+                  </pic:nvPicPr>
+                  <pic:blipFill>
+                    <a:blip r:embed="rId14"/>
+                    <a:stretch>
+                      <a:fillRect/>
+                    </a:stretch>
+                  </pic:blipFill>
+                  <pic:spPr>
+                    <a:xfrm>
+                      <a:off x="0" y="0"/>
+                      <a:ext cx="5534797" cy="3172268"/>
+                    </a:xfrm>
+                    <a:prstGeom prst="rect">
+                      <a:avLst/>
+                    </a:prstGeom>
+                  </pic:spPr>
+                </pic:pic>
+              </a:graphicData>
+            </a:graphic>
+          </wp:inline>
+        </w:drawing>
+      </w:r>
+    </w:p>
+    <w:p>
+      <w:pPr>
+        <w:pStyle w:val="ListParagraph"/>
+      </w:pPr>
+    </w:p>
+    <w:p>
+      <w:pPr>
+        <w:pStyle w:val="ListParagraph"/>
+      </w:pPr>
+      <w:r>
         <w:lastRenderedPageBreak/>
-        <w:t>R &amp;D team =&gt; research branch</w:t>
-      </w:r>
-    </w:p>
-    <w:p>
-      <w:pPr>
-        <w:pStyle w:val="ListParagraph"/>
-      </w:pPr>
-      <w:r>
-        <w:t>Prod team =&gt; release branch</w:t>
-      </w:r>
-    </w:p>
-    <w:p>
-      <w:pPr>
-        <w:pStyle w:val="ListParagraph"/>
-      </w:pPr>
-    </w:p>
-    <w:p>
-      <w:pPr>
-        <w:pStyle w:val="ListParagraph"/>
-      </w:pPr>
-      <w:r>
         <w:drawing>
           <wp:inline distT="0" distB="0" distL="0" distR="0" wp14:anchorId="0C5A3D8A" wp14:editId="7CF78ECD">
             <wp:extent cx="5534797" cy="3086531"/>
@@ -1774,7 +1851,7 @@
                     <pic:cNvPicPr/>
                   </pic:nvPicPr>
                   <pic:blipFill>
-                    <a:blip r:embed="rId14"/>
+                    <a:blip r:embed="rId15"/>
                     <a:stretch>
                       <a:fillRect/>
                     </a:stretch>
@@ -1883,6 +1960,51 @@
     <w:p>
       <w:pPr>
         <w:pStyle w:val="ListParagraph"/>
+        <w:numPr>
+          <w:ilvl w:val="0"/>
+          <w:numId w:val="1"/>
+        </w:numPr>
+      </w:pPr>
+      <w:r>
+        <w:t xml:space="preserve">If you are switching for the first time, you can use this </w:t>
+      </w:r>
+    </w:p>
+    <w:p>
+      <w:pPr>
+        <w:pStyle w:val="ListParagraph"/>
+      </w:pPr>
+      <w:r>
+        <w:t xml:space="preserve">                    Eg: git checkout --track origin/develop</w:t>
+      </w:r>
+    </w:p>
+    <w:p>
+      <w:pPr>
+        <w:pStyle w:val="ListParagraph"/>
+      </w:pPr>
+      <w:r>
+        <w:t xml:space="preserve"> From 2</w:t>
+      </w:r>
+      <w:r>
+        <w:rPr>
+          <w:vertAlign w:val="superscript"/>
+        </w:rPr>
+        <w:t>nd</w:t>
+      </w:r>
+      <w:r>
+        <w:t xml:space="preserve"> time </w:t>
+      </w:r>
+      <w:proofErr w:type="gramStart"/>
+      <w:r>
+        <w:t>onwards ,</w:t>
+      </w:r>
+      <w:proofErr w:type="gramEnd"/>
+      <w:r>
+        <w:t xml:space="preserve"> you can use below one</w:t>
+      </w:r>
+    </w:p>
+    <w:p>
+      <w:pPr>
+        <w:pStyle w:val="ListParagraph"/>
       </w:pPr>
       <w:r>
         <w:t xml:space="preserve">                  Eg: git checkout </w:t>
@@ -1943,7 +2065,7 @@
                     <pic:cNvPicPr/>
                   </pic:nvPicPr>
                   <pic:blipFill>
-                    <a:blip r:embed="rId15"/>
+                    <a:blip r:embed="rId16"/>
                     <a:stretch>
                       <a:fillRect/>
                     </a:stretch>
@@ -1965,9 +2087,723 @@
       </w:r>
     </w:p>
     <w:p/>
+    <w:p>
+      <w:pPr>
+        <w:rPr>
+          <w:b/>
+          <w:bCs/>
+        </w:rPr>
+      </w:pPr>
+      <w:r>
+        <w:rPr>
+          <w:b/>
+          <w:bCs/>
+          <w:highlight w:val="yellow"/>
+        </w:rPr>
+        <w:t>What is Pull Request?</w:t>
+      </w:r>
+    </w:p>
+    <w:p>
+      <w:pPr>
+        <w:pStyle w:val="ListParagraph"/>
+        <w:numPr>
+          <w:ilvl w:val="0"/>
+          <w:numId w:val="1"/>
+        </w:numPr>
+      </w:pPr>
+      <w:r>
+        <w:t>It is used to merge the changes from one branch to another branch</w:t>
+      </w:r>
+    </w:p>
+    <w:p>
+      <w:pPr>
+        <w:pStyle w:val="ListParagraph"/>
+      </w:pPr>
+      <w:r>
+        <w:t xml:space="preserve">        Eg: merge develop branch changes to main branch.</w:t>
+      </w:r>
+    </w:p>
     <w:p/>
     <w:p/>
+    <w:p>
+      <w:pPr>
+        <w:rPr>
+          <w:b/>
+          <w:bCs/>
+          <w:sz w:val="28"/>
+          <w:szCs w:val="28"/>
+        </w:rPr>
+      </w:pPr>
+      <w:r>
+        <w:rPr>
+          <w:b/>
+          <w:bCs/>
+          <w:highlight w:val="yellow"/>
+        </w:rPr>
+        <w:t>INTERVIEW QUESTIONS:</w:t>
+      </w:r>
+    </w:p>
+    <w:p>
+      <w:pPr>
+        <w:rPr>
+          <w:b/>
+          <w:bCs/>
+          <w:sz w:val="28"/>
+          <w:szCs w:val="28"/>
+        </w:rPr>
+      </w:pPr>
+      <w:r>
+        <w:rPr>
+          <w:b/>
+          <w:bCs/>
+          <w:sz w:val="28"/>
+          <w:szCs w:val="28"/>
+        </w:rPr>
+        <w:t>What is git stash?</w:t>
+      </w:r>
+    </w:p>
+    <w:p>
+      <w:pPr>
+        <w:pStyle w:val="ListParagraph"/>
+        <w:numPr>
+          <w:ilvl w:val="0"/>
+          <w:numId w:val="1"/>
+        </w:numPr>
+        <w:rPr>
+          <w:b/>
+          <w:bCs/>
+          <w:sz w:val="28"/>
+          <w:szCs w:val="28"/>
+        </w:rPr>
+      </w:pPr>
+      <w:r>
+        <w:rPr>
+          <w:b/>
+          <w:bCs/>
+          <w:sz w:val="28"/>
+          <w:szCs w:val="28"/>
+        </w:rPr>
+        <w:t>It is used to save working tree changes in backup and make working tree clean.</w:t>
+      </w:r>
+    </w:p>
+    <w:p>
+      <w:pPr>
+        <w:rPr>
+          <w:b/>
+          <w:bCs/>
+          <w:sz w:val="28"/>
+          <w:szCs w:val="28"/>
+        </w:rPr>
+      </w:pPr>
+    </w:p>
+    <w:p>
+      <w:r>
+        <w:t>Mother &amp; Son:</w:t>
+      </w:r>
+    </w:p>
+    <w:p>
+      <w:r>
+        <w:t>Watching movie in your home…. You are in middle of the movie</w:t>
+      </w:r>
+    </w:p>
+    <w:p>
+      <w:r>
+        <w:t>Mother asked to bring one milk packet from shop.</w:t>
+      </w:r>
+    </w:p>
+    <w:p>
+      <w:r>
+        <w:t>Manager &amp; Team member:</w:t>
+      </w:r>
+    </w:p>
+    <w:p>
+      <w:r>
+        <w:t xml:space="preserve">JIRA -101 Story assigned to me @ 9 </w:t>
+      </w:r>
+      <w:proofErr w:type="gramStart"/>
+      <w:r>
+        <w:t>AM..</w:t>
+      </w:r>
+      <w:proofErr w:type="gramEnd"/>
+      <w:r>
+        <w:t xml:space="preserve"> Work started … few changes </w:t>
+      </w:r>
+      <w:proofErr w:type="gramStart"/>
+      <w:r>
+        <w:t>completed..</w:t>
+      </w:r>
+      <w:proofErr w:type="gramEnd"/>
+      <w:r>
+        <w:t xml:space="preserve"> I am in middle of that story.</w:t>
+      </w:r>
+    </w:p>
+    <w:p>
+      <w:r>
+        <w:t>-----------------------------------git stash-----------------------------</w:t>
+      </w:r>
+    </w:p>
+    <w:p>
+      <w:r>
+        <w:t xml:space="preserve">@11 </w:t>
+      </w:r>
+      <w:proofErr w:type="gramStart"/>
+      <w:r>
+        <w:t>AM ,</w:t>
+      </w:r>
+      <w:proofErr w:type="gramEnd"/>
+      <w:r>
+        <w:t xml:space="preserve"> JIRA -102 assigned and it is very critical now…</w:t>
+      </w:r>
+    </w:p>
     <w:p/>
+    <w:p>
+      <w:pPr>
+        <w:pStyle w:val="ListParagraph"/>
+        <w:numPr>
+          <w:ilvl w:val="0"/>
+          <w:numId w:val="1"/>
+        </w:numPr>
+      </w:pPr>
+      <w:r>
+        <w:t>To complete JIRA -102 story first we need to stash 101 story related changes.</w:t>
+      </w:r>
+    </w:p>
+    <w:p>
+      <w:pPr>
+        <w:pStyle w:val="ListParagraph"/>
+        <w:numPr>
+          <w:ilvl w:val="0"/>
+          <w:numId w:val="1"/>
+        </w:numPr>
+      </w:pPr>
+      <w:r>
+        <w:lastRenderedPageBreak/>
+        <w:t>Once JIRA-102 story changes pushed then we can get 101 story changes using ‘git stash apply’ command.</w:t>
+      </w:r>
+    </w:p>
+    <w:p>
+      <w:r>
+        <w:t>-----------------------------------git stash apply --------------------------------</w:t>
+      </w:r>
+    </w:p>
+    <w:p/>
+    <w:p>
+      <w:pPr>
+        <w:rPr>
+          <w:b/>
+          <w:bCs/>
+        </w:rPr>
+      </w:pPr>
+      <w:r>
+        <w:rPr>
+          <w:b/>
+          <w:bCs/>
+          <w:highlight w:val="yellow"/>
+        </w:rPr>
+        <w:t>How to remove git local commits?</w:t>
+      </w:r>
+    </w:p>
+    <w:p>
+      <w:pPr>
+        <w:pStyle w:val="ListParagraph"/>
+        <w:numPr>
+          <w:ilvl w:val="0"/>
+          <w:numId w:val="1"/>
+        </w:numPr>
+      </w:pPr>
+      <w:r>
+        <w:t>Using git rest command we can undo local commits.</w:t>
+      </w:r>
+    </w:p>
+    <w:p>
+      <w:pPr>
+        <w:pStyle w:val="ListParagraph"/>
+        <w:numPr>
+          <w:ilvl w:val="0"/>
+          <w:numId w:val="1"/>
+        </w:numPr>
+      </w:pPr>
+      <w:r>
+        <w:t xml:space="preserve">Git reset </w:t>
+      </w:r>
+      <w:proofErr w:type="gramStart"/>
+      <w:r>
+        <w:t>we  can</w:t>
+      </w:r>
+      <w:proofErr w:type="gramEnd"/>
+      <w:r>
+        <w:t xml:space="preserve"> do in2 ways</w:t>
+      </w:r>
+    </w:p>
+    <w:p>
+      <w:pPr>
+        <w:pStyle w:val="ListParagraph"/>
+      </w:pPr>
+      <w:r>
+        <w:t xml:space="preserve">               1. </w:t>
+      </w:r>
+      <w:r>
+        <w:t>Soft</w:t>
+      </w:r>
+    </w:p>
+    <w:p>
+      <w:pPr>
+        <w:pStyle w:val="ListParagraph"/>
+      </w:pPr>
+      <w:r>
+        <w:t xml:space="preserve">               2. </w:t>
+      </w:r>
+      <w:r>
+        <w:t>Hard</w:t>
+      </w:r>
+    </w:p>
+    <w:p>
+      <w:pPr>
+        <w:pStyle w:val="ListParagraph"/>
+        <w:numPr>
+          <w:ilvl w:val="0"/>
+          <w:numId w:val="1"/>
+        </w:numPr>
+      </w:pPr>
+      <w:r>
+        <w:t>Soft reset means only local commit will be deleted and file changes will be there in staging area.</w:t>
+      </w:r>
+    </w:p>
+    <w:p>
+      <w:pPr>
+        <w:pStyle w:val="ListParagraph"/>
+      </w:pPr>
+      <w:r>
+        <w:t xml:space="preserve">                               Eg: git reset –soft HEAD~1 </w:t>
+      </w:r>
+    </w:p>
+    <w:p>
+      <w:pPr>
+        <w:pStyle w:val="ListParagraph"/>
+        <w:numPr>
+          <w:ilvl w:val="0"/>
+          <w:numId w:val="1"/>
+        </w:numPr>
+      </w:pPr>
+      <w:r>
+        <w:t xml:space="preserve">Hard reset </w:t>
+      </w:r>
+      <w:r>
+        <w:t>means</w:t>
+      </w:r>
+      <w:r>
+        <w:t xml:space="preserve"> local commit will be deleted and file changes also will be deleted from working tree.</w:t>
+      </w:r>
+    </w:p>
+    <w:p>
+      <w:pPr>
+        <w:pStyle w:val="ListParagraph"/>
+      </w:pPr>
+      <w:r>
+        <w:t xml:space="preserve">                               Eg: </w:t>
+      </w:r>
+      <w:r>
+        <w:t>git reset –</w:t>
+      </w:r>
+      <w:r>
+        <w:t xml:space="preserve">hard </w:t>
+      </w:r>
+      <w:r>
+        <w:t>HEAD~1</w:t>
+      </w:r>
+    </w:p>
+    <w:p/>
+    <w:p>
+      <w:pPr>
+        <w:rPr>
+          <w:b/>
+          <w:bCs/>
+        </w:rPr>
+      </w:pPr>
+      <w:r>
+        <w:rPr>
+          <w:b/>
+          <w:bCs/>
+          <w:highlight w:val="yellow"/>
+        </w:rPr>
+        <w:t>How to revert git central repo commits?</w:t>
+      </w:r>
+    </w:p>
+    <w:p>
+      <w:pPr>
+        <w:pStyle w:val="ListParagraph"/>
+        <w:numPr>
+          <w:ilvl w:val="0"/>
+          <w:numId w:val="1"/>
+        </w:numPr>
+      </w:pPr>
+      <w:proofErr w:type="gramStart"/>
+      <w:r>
+        <w:t>Using  ‘</w:t>
+      </w:r>
+      <w:proofErr w:type="gramEnd"/>
+      <w:r>
+        <w:t>git revert’ command we can revert code changes from central repo.</w:t>
+      </w:r>
+    </w:p>
+    <w:p>
+      <w:pPr>
+        <w:pStyle w:val="ListParagraph"/>
+      </w:pPr>
+      <w:r>
+        <w:t xml:space="preserve">                        Eg: git revert &lt;commit-id&gt;</w:t>
+      </w:r>
+    </w:p>
+    <w:p>
+      <w:pPr>
+        <w:pStyle w:val="ListParagraph"/>
+        <w:rPr>
+          <w:b/>
+          <w:bCs/>
+        </w:rPr>
+      </w:pPr>
+      <w:r>
+        <w:rPr>
+          <w:b/>
+          <w:bCs/>
+          <w:highlight w:val="green"/>
+        </w:rPr>
+        <w:t xml:space="preserve">NOTE: After git revert </w:t>
+      </w:r>
+      <w:proofErr w:type="gramStart"/>
+      <w:r>
+        <w:rPr>
+          <w:b/>
+          <w:bCs/>
+          <w:highlight w:val="green"/>
+        </w:rPr>
+        <w:t>execution</w:t>
+      </w:r>
+      <w:proofErr w:type="gramEnd"/>
+      <w:r>
+        <w:rPr>
+          <w:b/>
+          <w:bCs/>
+          <w:highlight w:val="green"/>
+        </w:rPr>
+        <w:t xml:space="preserve"> we need execute git push.</w:t>
+      </w:r>
+    </w:p>
+    <w:p>
+      <w:pPr>
+        <w:rPr>
+          <w:b/>
+          <w:bCs/>
+        </w:rPr>
+      </w:pPr>
+    </w:p>
+    <w:p>
+      <w:pPr>
+        <w:rPr>
+          <w:b/>
+          <w:bCs/>
+        </w:rPr>
+      </w:pPr>
+      <w:r>
+        <w:rPr>
+          <w:b/>
+          <w:bCs/>
+          <w:highlight w:val="yellow"/>
+        </w:rPr>
+        <w:t xml:space="preserve">What is git </w:t>
+      </w:r>
+      <w:proofErr w:type="gramStart"/>
+      <w:r>
+        <w:rPr>
+          <w:b/>
+          <w:bCs/>
+          <w:highlight w:val="yellow"/>
+        </w:rPr>
+        <w:t>cherry-pick</w:t>
+      </w:r>
+      <w:proofErr w:type="gramEnd"/>
+      <w:r>
+        <w:rPr>
+          <w:b/>
+          <w:bCs/>
+          <w:highlight w:val="yellow"/>
+        </w:rPr>
+        <w:t>?</w:t>
+      </w:r>
+    </w:p>
+    <w:p>
+      <w:pPr>
+        <w:pStyle w:val="ListParagraph"/>
+        <w:numPr>
+          <w:ilvl w:val="0"/>
+          <w:numId w:val="1"/>
+        </w:numPr>
+      </w:pPr>
+      <w:r>
+        <w:t>When we use ‘git merge’ command by default all commits will merge from one branch to another branch.</w:t>
+      </w:r>
+    </w:p>
+    <w:p>
+      <w:pPr>
+        <w:pStyle w:val="ListParagraph"/>
+        <w:numPr>
+          <w:ilvl w:val="0"/>
+          <w:numId w:val="1"/>
+        </w:numPr>
+      </w:pPr>
+      <w:r>
+        <w:t>If we want to merge specific commit from one branch to another branch then we can use ‘git cherry-pick.</w:t>
+      </w:r>
+    </w:p>
+    <w:p>
+      <w:pPr>
+        <w:pStyle w:val="ListParagraph"/>
+      </w:pPr>
+      <w:r>
+        <w:t xml:space="preserve">                                   Eg: git cherry-</w:t>
+      </w:r>
+      <w:proofErr w:type="gramStart"/>
+      <w:r>
+        <w:t>pick  &lt;</w:t>
+      </w:r>
+      <w:proofErr w:type="spellStart"/>
+      <w:proofErr w:type="gramEnd"/>
+      <w:r>
+        <w:t>commit_id</w:t>
+      </w:r>
+      <w:proofErr w:type="spellEnd"/>
+      <w:r>
+        <w:t>&gt;.</w:t>
+      </w:r>
+    </w:p>
+    <w:p/>
+    <w:p>
+      <w:r>
+        <w:rPr>
+          <w:highlight w:val="yellow"/>
+        </w:rPr>
+        <w:t>GIT Pull vs GIT Fetch?</w:t>
+      </w:r>
+    </w:p>
+    <w:p>
+      <w:r>
+        <w:lastRenderedPageBreak/>
+        <w:drawing>
+          <wp:inline distT="0" distB="0" distL="0" distR="0" wp14:anchorId="199ED91B" wp14:editId="7DFB9FBF">
+            <wp:extent cx="3400900" cy="2876951"/>
+            <wp:effectExtent l="0" t="0" r="9525" b="0"/>
+            <wp:docPr id="1671322781" name="Picture 1"/>
+            <wp:cNvGraphicFramePr>
+              <a:graphicFrameLocks xmlns:a="http://schemas.openxmlformats.org/drawingml/2006/main" noChangeAspect="1"/>
+            </wp:cNvGraphicFramePr>
+            <a:graphic xmlns:a="http://schemas.openxmlformats.org/drawingml/2006/main">
+              <a:graphicData uri="http://schemas.openxmlformats.org/drawingml/2006/picture">
+                <pic:pic xmlns:pic="http://schemas.openxmlformats.org/drawingml/2006/picture">
+                  <pic:nvPicPr>
+                    <pic:cNvPr id="1671322781" name=""/>
+                    <pic:cNvPicPr/>
+                  </pic:nvPicPr>
+                  <pic:blipFill>
+                    <a:blip r:embed="rId17"/>
+                    <a:stretch>
+                      <a:fillRect/>
+                    </a:stretch>
+                  </pic:blipFill>
+                  <pic:spPr>
+                    <a:xfrm>
+                      <a:off x="0" y="0"/>
+                      <a:ext cx="3400900" cy="2876951"/>
+                    </a:xfrm>
+                    <a:prstGeom prst="rect">
+                      <a:avLst/>
+                    </a:prstGeom>
+                  </pic:spPr>
+                </pic:pic>
+              </a:graphicData>
+            </a:graphic>
+          </wp:inline>
+        </w:drawing>
+      </w:r>
+    </w:p>
+    <w:p/>
+    <w:p>
+      <w:r>
+        <w:t xml:space="preserve">git </w:t>
+      </w:r>
+      <w:proofErr w:type="gramStart"/>
+      <w:r>
+        <w:t>pull :</w:t>
+      </w:r>
+      <w:proofErr w:type="gramEnd"/>
+      <w:r>
+        <w:t xml:space="preserve"> download latest </w:t>
+      </w:r>
+      <w:proofErr w:type="gramStart"/>
+      <w:r>
+        <w:t>changes  from</w:t>
+      </w:r>
+      <w:proofErr w:type="gramEnd"/>
+      <w:r>
+        <w:t xml:space="preserve"> central to working tree directly.</w:t>
+      </w:r>
+    </w:p>
+    <w:p>
+      <w:r>
+        <w:t>git fetch: download from central to local repo only.</w:t>
+      </w:r>
+    </w:p>
+    <w:p>
+      <w:pPr>
+        <w:rPr>
+          <w:b/>
+          <w:bCs/>
+        </w:rPr>
+      </w:pPr>
+      <w:r>
+        <w:rPr>
+          <w:b/>
+          <w:bCs/>
+          <w:highlight w:val="green"/>
+        </w:rPr>
+        <w:t xml:space="preserve">NOTE: To merge changes from </w:t>
+      </w:r>
+      <w:proofErr w:type="gramStart"/>
+      <w:r>
+        <w:rPr>
+          <w:b/>
+          <w:bCs/>
+          <w:highlight w:val="green"/>
+        </w:rPr>
+        <w:t>local</w:t>
+      </w:r>
+      <w:proofErr w:type="gramEnd"/>
+      <w:r>
+        <w:rPr>
+          <w:b/>
+          <w:bCs/>
+          <w:highlight w:val="green"/>
+        </w:rPr>
+        <w:t xml:space="preserve"> reop to working tree we can use ‘git merge’ command.</w:t>
+      </w:r>
+    </w:p>
+    <w:p>
+      <w:r>
+        <w:t xml:space="preserve">                                          git pull: git fetch + git merge</w:t>
+      </w:r>
+      <w:r>
+        <w:t>.</w:t>
+      </w:r>
+    </w:p>
+    <w:p/>
+    <w:p>
+      <w:pPr>
+        <w:rPr>
+          <w:b/>
+          <w:bCs/>
+        </w:rPr>
+      </w:pPr>
+      <w:r>
+        <w:rPr>
+          <w:b/>
+          <w:bCs/>
+          <w:highlight w:val="yellow"/>
+        </w:rPr>
+        <w:t>What is git fork?</w:t>
+      </w:r>
+    </w:p>
+    <w:p>
+      <w:pPr>
+        <w:pStyle w:val="ListParagraph"/>
+        <w:numPr>
+          <w:ilvl w:val="0"/>
+          <w:numId w:val="1"/>
+        </w:numPr>
+      </w:pPr>
+      <w:r>
+        <w:t xml:space="preserve">It is used to copy somebody’s git repo into our </w:t>
+      </w:r>
+      <w:proofErr w:type="spellStart"/>
+      <w:r>
+        <w:t>github</w:t>
+      </w:r>
+      <w:proofErr w:type="spellEnd"/>
+      <w:r>
+        <w:t xml:space="preserve"> account.</w:t>
+      </w:r>
+    </w:p>
+    <w:p>
+      <w:pPr>
+        <w:rPr>
+          <w:b/>
+          <w:bCs/>
+        </w:rPr>
+      </w:pPr>
+      <w:r>
+        <w:rPr>
+          <w:b/>
+          <w:bCs/>
+          <w:highlight w:val="green"/>
+        </w:rPr>
+        <w:t xml:space="preserve">NOTE: When we want to work with </w:t>
+      </w:r>
+      <w:proofErr w:type="gramStart"/>
+      <w:r>
+        <w:rPr>
+          <w:b/>
+          <w:bCs/>
+          <w:highlight w:val="green"/>
+        </w:rPr>
+        <w:t>open source</w:t>
+      </w:r>
+      <w:proofErr w:type="gramEnd"/>
+      <w:r>
+        <w:rPr>
+          <w:b/>
+          <w:bCs/>
+          <w:highlight w:val="green"/>
+        </w:rPr>
+        <w:t xml:space="preserve"> projects then we can use git forking option.</w:t>
+      </w:r>
+    </w:p>
+    <w:p>
+      <w:pPr>
+        <w:rPr>
+          <w:b/>
+          <w:bCs/>
+        </w:rPr>
+      </w:pPr>
+    </w:p>
+    <w:p>
+      <w:pPr>
+        <w:rPr>
+          <w:b/>
+          <w:bCs/>
+        </w:rPr>
+      </w:pPr>
+      <w:r>
+        <w:rPr>
+          <w:b/>
+          <w:bCs/>
+          <w:highlight w:val="green"/>
+        </w:rPr>
+        <w:t>NOTE: Repository will be created by DevOps team. But you can create the multiple branches</w:t>
+      </w:r>
+      <w:r>
+        <w:rPr>
+          <w:b/>
+          <w:bCs/>
+        </w:rPr>
+        <w:t xml:space="preserve"> </w:t>
+      </w:r>
+    </w:p>
+    <w:p>
+      <w:pPr>
+        <w:rPr>
+          <w:b/>
+          <w:bCs/>
+        </w:rPr>
+      </w:pPr>
+    </w:p>
     <w:p/>
     <w:sectPr>
       <w:pgSz w:w="11906" w:h="16838"/>
@@ -2927,6 +3763,119 @@
     </w:lvl>
   </w:abstractNum>
   <w:abstractNum w:abstractNumId="9" w15:restartNumberingAfterBreak="0">
+    <w:nsid w:val="438B6431"/>
+    <w:multiLevelType w:val="hybridMultilevel"/>
+    <w:tmpl w:val="F4F62CFA"/>
+    <w:lvl w:ilvl="0" w:tplc="40090001">
+      <w:start w:val="1"/>
+      <w:numFmt w:val="bullet"/>
+      <w:lvlText w:val=""/>
+      <w:lvlJc w:val="left"/>
+      <w:pPr>
+        <w:ind w:left="1493" w:hanging="360"/>
+      </w:pPr>
+      <w:rPr>
+        <w:rFonts w:ascii="Symbol" w:hAnsi="Symbol" w:hint="default"/>
+      </w:rPr>
+    </w:lvl>
+    <w:lvl w:ilvl="1" w:tplc="40090003" w:tentative="1">
+      <w:start w:val="1"/>
+      <w:numFmt w:val="bullet"/>
+      <w:lvlText w:val="o"/>
+      <w:lvlJc w:val="left"/>
+      <w:pPr>
+        <w:ind w:left="2213" w:hanging="360"/>
+      </w:pPr>
+      <w:rPr>
+        <w:rFonts w:ascii="Courier New" w:hAnsi="Courier New" w:cs="Courier New" w:hint="default"/>
+      </w:rPr>
+    </w:lvl>
+    <w:lvl w:ilvl="2" w:tplc="40090005" w:tentative="1">
+      <w:start w:val="1"/>
+      <w:numFmt w:val="bullet"/>
+      <w:lvlText w:val=""/>
+      <w:lvlJc w:val="left"/>
+      <w:pPr>
+        <w:ind w:left="2933" w:hanging="360"/>
+      </w:pPr>
+      <w:rPr>
+        <w:rFonts w:ascii="Wingdings" w:hAnsi="Wingdings" w:hint="default"/>
+      </w:rPr>
+    </w:lvl>
+    <w:lvl w:ilvl="3" w:tplc="40090001" w:tentative="1">
+      <w:start w:val="1"/>
+      <w:numFmt w:val="bullet"/>
+      <w:lvlText w:val=""/>
+      <w:lvlJc w:val="left"/>
+      <w:pPr>
+        <w:ind w:left="3653" w:hanging="360"/>
+      </w:pPr>
+      <w:rPr>
+        <w:rFonts w:ascii="Symbol" w:hAnsi="Symbol" w:hint="default"/>
+      </w:rPr>
+    </w:lvl>
+    <w:lvl w:ilvl="4" w:tplc="40090003" w:tentative="1">
+      <w:start w:val="1"/>
+      <w:numFmt w:val="bullet"/>
+      <w:lvlText w:val="o"/>
+      <w:lvlJc w:val="left"/>
+      <w:pPr>
+        <w:ind w:left="4373" w:hanging="360"/>
+      </w:pPr>
+      <w:rPr>
+        <w:rFonts w:ascii="Courier New" w:hAnsi="Courier New" w:cs="Courier New" w:hint="default"/>
+      </w:rPr>
+    </w:lvl>
+    <w:lvl w:ilvl="5" w:tplc="40090005" w:tentative="1">
+      <w:start w:val="1"/>
+      <w:numFmt w:val="bullet"/>
+      <w:lvlText w:val=""/>
+      <w:lvlJc w:val="left"/>
+      <w:pPr>
+        <w:ind w:left="5093" w:hanging="360"/>
+      </w:pPr>
+      <w:rPr>
+        <w:rFonts w:ascii="Wingdings" w:hAnsi="Wingdings" w:hint="default"/>
+      </w:rPr>
+    </w:lvl>
+    <w:lvl w:ilvl="6" w:tplc="40090001" w:tentative="1">
+      <w:start w:val="1"/>
+      <w:numFmt w:val="bullet"/>
+      <w:lvlText w:val=""/>
+      <w:lvlJc w:val="left"/>
+      <w:pPr>
+        <w:ind w:left="5813" w:hanging="360"/>
+      </w:pPr>
+      <w:rPr>
+        <w:rFonts w:ascii="Symbol" w:hAnsi="Symbol" w:hint="default"/>
+      </w:rPr>
+    </w:lvl>
+    <w:lvl w:ilvl="7" w:tplc="40090003" w:tentative="1">
+      <w:start w:val="1"/>
+      <w:numFmt w:val="bullet"/>
+      <w:lvlText w:val="o"/>
+      <w:lvlJc w:val="left"/>
+      <w:pPr>
+        <w:ind w:left="6533" w:hanging="360"/>
+      </w:pPr>
+      <w:rPr>
+        <w:rFonts w:ascii="Courier New" w:hAnsi="Courier New" w:cs="Courier New" w:hint="default"/>
+      </w:rPr>
+    </w:lvl>
+    <w:lvl w:ilvl="8" w:tplc="40090005" w:tentative="1">
+      <w:start w:val="1"/>
+      <w:numFmt w:val="bullet"/>
+      <w:lvlText w:val=""/>
+      <w:lvlJc w:val="left"/>
+      <w:pPr>
+        <w:ind w:left="7253" w:hanging="360"/>
+      </w:pPr>
+      <w:rPr>
+        <w:rFonts w:ascii="Wingdings" w:hAnsi="Wingdings" w:hint="default"/>
+      </w:rPr>
+    </w:lvl>
+  </w:abstractNum>
+  <w:abstractNum w:abstractNumId="10" w15:restartNumberingAfterBreak="0">
     <w:nsid w:val="44FD6A5D"/>
     <w:multiLevelType w:val="hybridMultilevel"/>
     <w:tmpl w:val="8B524D06"/>
@@ -3039,7 +3988,7 @@
       </w:rPr>
     </w:lvl>
   </w:abstractNum>
-  <w:abstractNum w:abstractNumId="10" w15:restartNumberingAfterBreak="0">
+  <w:abstractNum w:abstractNumId="11" w15:restartNumberingAfterBreak="0">
     <w:nsid w:val="4A402F96"/>
     <w:multiLevelType w:val="hybridMultilevel"/>
     <w:tmpl w:val="AA30A896"/>
@@ -3152,7 +4101,7 @@
       </w:rPr>
     </w:lvl>
   </w:abstractNum>
-  <w:abstractNum w:abstractNumId="11" w15:restartNumberingAfterBreak="0">
+  <w:abstractNum w:abstractNumId="12" w15:restartNumberingAfterBreak="0">
     <w:nsid w:val="573E2418"/>
     <w:multiLevelType w:val="hybridMultilevel"/>
     <w:tmpl w:val="FF448C42"/>
@@ -3265,7 +4214,7 @@
       </w:rPr>
     </w:lvl>
   </w:abstractNum>
-  <w:abstractNum w:abstractNumId="12" w15:restartNumberingAfterBreak="0">
+  <w:abstractNum w:abstractNumId="13" w15:restartNumberingAfterBreak="0">
     <w:nsid w:val="5E17516D"/>
     <w:multiLevelType w:val="hybridMultilevel"/>
     <w:tmpl w:val="15EEB1D8"/>
@@ -3354,7 +4303,7 @@
       </w:pPr>
     </w:lvl>
   </w:abstractNum>
-  <w:abstractNum w:abstractNumId="13" w15:restartNumberingAfterBreak="0">
+  <w:abstractNum w:abstractNumId="14" w15:restartNumberingAfterBreak="0">
     <w:nsid w:val="5F5338C2"/>
     <w:multiLevelType w:val="hybridMultilevel"/>
     <w:tmpl w:val="C750BF2C"/>
@@ -3443,10 +4392,10 @@
       </w:pPr>
     </w:lvl>
   </w:abstractNum>
-  <w:abstractNum w:abstractNumId="14" w15:restartNumberingAfterBreak="0">
+  <w:abstractNum w:abstractNumId="15" w15:restartNumberingAfterBreak="0">
     <w:nsid w:val="66CD1861"/>
     <w:multiLevelType w:val="hybridMultilevel"/>
-    <w:tmpl w:val="7DF6CBEA"/>
+    <w:tmpl w:val="B6FA498C"/>
     <w:lvl w:ilvl="0" w:tplc="D5523242">
       <w:start w:val="21"/>
       <w:numFmt w:val="bullet"/>
@@ -3556,7 +4505,7 @@
       </w:rPr>
     </w:lvl>
   </w:abstractNum>
-  <w:abstractNum w:abstractNumId="15" w15:restartNumberingAfterBreak="0">
+  <w:abstractNum w:abstractNumId="16" w15:restartNumberingAfterBreak="0">
     <w:nsid w:val="6E504E39"/>
     <w:multiLevelType w:val="hybridMultilevel"/>
     <w:tmpl w:val="67E672CE"/>
@@ -3669,7 +4618,7 @@
       </w:rPr>
     </w:lvl>
   </w:abstractNum>
-  <w:abstractNum w:abstractNumId="16" w15:restartNumberingAfterBreak="0">
+  <w:abstractNum w:abstractNumId="17" w15:restartNumberingAfterBreak="0">
     <w:nsid w:val="785C2E3E"/>
     <w:multiLevelType w:val="hybridMultilevel"/>
     <w:tmpl w:val="7BC4920E"/>
@@ -3782,8 +4731,97 @@
       </w:rPr>
     </w:lvl>
   </w:abstractNum>
+  <w:abstractNum w:abstractNumId="18" w15:restartNumberingAfterBreak="0">
+    <w:nsid w:val="7DEE5D45"/>
+    <w:multiLevelType w:val="hybridMultilevel"/>
+    <w:tmpl w:val="2B3CE5F8"/>
+    <w:lvl w:ilvl="0" w:tplc="4009000F">
+      <w:start w:val="1"/>
+      <w:numFmt w:val="decimal"/>
+      <w:lvlText w:val="%1."/>
+      <w:lvlJc w:val="left"/>
+      <w:pPr>
+        <w:ind w:left="720" w:hanging="360"/>
+      </w:pPr>
+      <w:rPr>
+        <w:rFonts w:hint="default"/>
+      </w:rPr>
+    </w:lvl>
+    <w:lvl w:ilvl="1" w:tplc="40090019" w:tentative="1">
+      <w:start w:val="1"/>
+      <w:numFmt w:val="lowerLetter"/>
+      <w:lvlText w:val="%2."/>
+      <w:lvlJc w:val="left"/>
+      <w:pPr>
+        <w:ind w:left="1440" w:hanging="360"/>
+      </w:pPr>
+    </w:lvl>
+    <w:lvl w:ilvl="2" w:tplc="4009001B" w:tentative="1">
+      <w:start w:val="1"/>
+      <w:numFmt w:val="lowerRoman"/>
+      <w:lvlText w:val="%3."/>
+      <w:lvlJc w:val="right"/>
+      <w:pPr>
+        <w:ind w:left="2160" w:hanging="180"/>
+      </w:pPr>
+    </w:lvl>
+    <w:lvl w:ilvl="3" w:tplc="4009000F" w:tentative="1">
+      <w:start w:val="1"/>
+      <w:numFmt w:val="decimal"/>
+      <w:lvlText w:val="%4."/>
+      <w:lvlJc w:val="left"/>
+      <w:pPr>
+        <w:ind w:left="2880" w:hanging="360"/>
+      </w:pPr>
+    </w:lvl>
+    <w:lvl w:ilvl="4" w:tplc="40090019" w:tentative="1">
+      <w:start w:val="1"/>
+      <w:numFmt w:val="lowerLetter"/>
+      <w:lvlText w:val="%5."/>
+      <w:lvlJc w:val="left"/>
+      <w:pPr>
+        <w:ind w:left="3600" w:hanging="360"/>
+      </w:pPr>
+    </w:lvl>
+    <w:lvl w:ilvl="5" w:tplc="4009001B" w:tentative="1">
+      <w:start w:val="1"/>
+      <w:numFmt w:val="lowerRoman"/>
+      <w:lvlText w:val="%6."/>
+      <w:lvlJc w:val="right"/>
+      <w:pPr>
+        <w:ind w:left="4320" w:hanging="180"/>
+      </w:pPr>
+    </w:lvl>
+    <w:lvl w:ilvl="6" w:tplc="4009000F" w:tentative="1">
+      <w:start w:val="1"/>
+      <w:numFmt w:val="decimal"/>
+      <w:lvlText w:val="%7."/>
+      <w:lvlJc w:val="left"/>
+      <w:pPr>
+        <w:ind w:left="5040" w:hanging="360"/>
+      </w:pPr>
+    </w:lvl>
+    <w:lvl w:ilvl="7" w:tplc="40090019" w:tentative="1">
+      <w:start w:val="1"/>
+      <w:numFmt w:val="lowerLetter"/>
+      <w:lvlText w:val="%8."/>
+      <w:lvlJc w:val="left"/>
+      <w:pPr>
+        <w:ind w:left="5760" w:hanging="360"/>
+      </w:pPr>
+    </w:lvl>
+    <w:lvl w:ilvl="8" w:tplc="4009001B" w:tentative="1">
+      <w:start w:val="1"/>
+      <w:numFmt w:val="lowerRoman"/>
+      <w:lvlText w:val="%9."/>
+      <w:lvlJc w:val="right"/>
+      <w:pPr>
+        <w:ind w:left="6480" w:hanging="180"/>
+      </w:pPr>
+    </w:lvl>
+  </w:abstractNum>
   <w:num w:numId="1" w16cid:durableId="1822039701">
-    <w:abstractNumId w:val="14"/>
+    <w:abstractNumId w:val="15"/>
   </w:num>
   <w:num w:numId="2" w16cid:durableId="1020425087">
     <w:abstractNumId w:val="7"/>
@@ -3792,7 +4830,7 @@
     <w:abstractNumId w:val="1"/>
   </w:num>
   <w:num w:numId="4" w16cid:durableId="1586497649">
-    <w:abstractNumId w:val="12"/>
+    <w:abstractNumId w:val="13"/>
   </w:num>
   <w:num w:numId="5" w16cid:durableId="1824850840">
     <w:abstractNumId w:val="5"/>
@@ -3813,25 +4851,31 @@
     <w:abstractNumId w:val="6"/>
   </w:num>
   <w:num w:numId="11" w16cid:durableId="2044864572">
-    <w:abstractNumId w:val="9"/>
+    <w:abstractNumId w:val="10"/>
   </w:num>
   <w:num w:numId="12" w16cid:durableId="1772360497">
-    <w:abstractNumId w:val="15"/>
+    <w:abstractNumId w:val="16"/>
   </w:num>
   <w:num w:numId="13" w16cid:durableId="208761631">
     <w:abstractNumId w:val="8"/>
   </w:num>
   <w:num w:numId="14" w16cid:durableId="1179587731">
-    <w:abstractNumId w:val="16"/>
+    <w:abstractNumId w:val="17"/>
   </w:num>
   <w:num w:numId="15" w16cid:durableId="2046830032">
-    <w:abstractNumId w:val="10"/>
+    <w:abstractNumId w:val="11"/>
   </w:num>
   <w:num w:numId="16" w16cid:durableId="1218517939">
-    <w:abstractNumId w:val="11"/>
+    <w:abstractNumId w:val="12"/>
   </w:num>
   <w:num w:numId="17" w16cid:durableId="1580478462">
-    <w:abstractNumId w:val="13"/>
+    <w:abstractNumId w:val="14"/>
+  </w:num>
+  <w:num w:numId="18" w16cid:durableId="577716131">
+    <w:abstractNumId w:val="18"/>
+  </w:num>
+  <w:num w:numId="19" w16cid:durableId="29032932">
+    <w:abstractNumId w:val="9"/>
   </w:num>
 </w:numbering>
 </file>

</xml_diff>